<commit_message>
Cap nhat thoi gian bieu UNIGO, TKB ca nhan gv Dau Dinh Nguyen va slide/KHBD Tiet 0 Robotics
</commit_message>
<xml_diff>
--- a/Thời khóa biểu giáo viên/Thời khóa biểu - Đậu Đình Nguyên.docx
+++ b/Thời khóa biểu giáo viên/Thời khóa biểu - Đậu Đình Nguyên.docx
@@ -4,56 +4,81 @@
   <w:body>
     <w:p>
       <w:pPr>
+        <w:spacing w:after="40"/>
         <w:jc w:val="center"/>
       </w:pPr>
       <w:r>
         <w:rPr>
           <w:rFonts w:ascii="Times New Roman" w:hAnsi="Times New Roman"/>
           <w:b/>
-          <w:sz w:val="30"/>
+          <w:i w:val="0"/>
+          <w:color w:val="646E8C"/>
+          <w:sz w:val="20"/>
         </w:rPr>
-        <w:t>THỜI KHOÁ BIỂU CÁ NHÂN GIÁO VIÊN: ĐẬU ĐÌNH NGUYÊN</w:t>
-        <w:br/>
+        <w:t>UNIGO COLLEGE — JUNIOR &amp; MIDDLE SCHOOL</w:t>
       </w:r>
+    </w:p>
+    <w:p>
+      <w:pPr>
+        <w:spacing w:after="80"/>
+        <w:jc w:val="center"/>
+      </w:pPr>
       <w:r>
         <w:rPr>
           <w:rFonts w:ascii="Times New Roman" w:hAnsi="Times New Roman"/>
-          <w:i/>
-          <w:sz w:val="26"/>
+          <w:b/>
+          <w:i w:val="0"/>
+          <w:color w:val="1D2A64"/>
+          <w:sz w:val="32"/>
         </w:rPr>
-        <w:t>Bộ môn: Tin học &amp; Robotics | Tổng số tiết/tuần: 26 tiết</w:t>
-        <w:br/>
+        <w:t>THỜI KHOÁ BIỂU CÁ NHÂN GIÁO VIÊN: ĐẬU ĐÌNH NGUYÊN</w:t>
+      </w:r>
+    </w:p>
+    <w:p>
+      <w:pPr>
+        <w:spacing w:after="240"/>
+        <w:jc w:val="center"/>
+      </w:pPr>
+      <w:r>
+        <w:rPr>
+          <w:rFonts w:ascii="Times New Roman" w:hAnsi="Times New Roman"/>
+          <w:b/>
+          <w:i w:val="0"/>
+          <w:color w:val="0F172A"/>
+          <w:sz w:val="22"/>
+        </w:rPr>
+        <w:t>Bộ môn: Tin học &amp; Robotics  |  Tổng số tiết/tuần: 26 tiết  |  Áp dụng từ 04/08/2025</w:t>
       </w:r>
     </w:p>
     <w:tbl>
       <w:tblPr>
-        <w:tblStyle w:val="TableGrid"/>
         <w:tblW w:type="auto" w:w="0"/>
+        <w:jc w:val="center"/>
         <w:tblLook w:firstColumn="1" w:firstRow="1" w:lastColumn="0" w:lastRow="0" w:noHBand="0" w:noVBand="1" w:val="04A0"/>
-        <w:tblBorders>
-          <w:top w:val="single" w:sz="4" w:space="0" w:color="000000"/>
-          <w:left w:val="single" w:sz="4" w:space="0" w:color="000000"/>
-          <w:bottom w:val="single" w:sz="4" w:space="0" w:color="000000"/>
-          <w:right w:val="single" w:sz="4" w:space="0" w:color="000000"/>
-          <w:insideH w:val="single" w:sz="4" w:space="0" w:color="000000"/>
-          <w:insideV w:val="single" w:sz="4" w:space="0" w:color="000000"/>
-        </w:tblBorders>
       </w:tblPr>
       <w:tblGrid>
-        <w:gridCol w:w="1080"/>
-        <w:gridCol w:w="1080"/>
-        <w:gridCol w:w="1080"/>
-        <w:gridCol w:w="1080"/>
-        <w:gridCol w:w="1080"/>
-        <w:gridCol w:w="1080"/>
-        <w:gridCol w:w="1080"/>
-        <w:gridCol w:w="1080"/>
+        <w:gridCol w:w="1710"/>
+        <w:gridCol w:w="1710"/>
+        <w:gridCol w:w="1710"/>
+        <w:gridCol w:w="1710"/>
+        <w:gridCol w:w="1710"/>
+        <w:gridCol w:w="1710"/>
+        <w:gridCol w:w="1710"/>
+        <w:gridCol w:w="1710"/>
+        <w:gridCol w:w="1710"/>
       </w:tblGrid>
       <w:tr>
         <w:tc>
           <w:tcPr>
-            <w:tcW w:type="dxa" w:w="1080"/>
-            <w:shd w:fill="1F497D"/>
+            <w:tcW w:type="dxa" w:w="1296"/>
+            <w:shd w:fill="1D2A64"/>
+            <w:tcBorders>
+              <w:top w:val="single" w:sz="4" w:space="0" w:color="1D2A64"/>
+              <w:left w:val="single" w:sz="4" w:space="0" w:color="1D2A64"/>
+              <w:bottom w:val="single" w:sz="4" w:space="0" w:color="1D2A64"/>
+              <w:right w:val="single" w:sz="4" w:space="0" w:color="1D2A64"/>
+            </w:tcBorders>
+            <w:vAlign w:val="center"/>
           </w:tcPr>
           <w:p>
             <w:pPr>
@@ -63,8 +88,9 @@
               <w:rPr>
                 <w:rFonts w:ascii="Times New Roman" w:hAnsi="Times New Roman"/>
                 <w:b/>
+                <w:i w:val="0"/>
                 <w:color w:val="FFFFFF"/>
-                <w:sz w:val="24"/>
+                <w:sz w:val="21"/>
               </w:rPr>
               <w:t>BUỔI</w:t>
             </w:r>
@@ -72,8 +98,15 @@
         </w:tc>
         <w:tc>
           <w:tcPr>
-            <w:tcW w:type="dxa" w:w="1080"/>
-            <w:shd w:fill="1F497D"/>
+            <w:tcW w:type="dxa" w:w="1152"/>
+            <w:shd w:fill="1D2A64"/>
+            <w:tcBorders>
+              <w:top w:val="single" w:sz="4" w:space="0" w:color="1D2A64"/>
+              <w:left w:val="single" w:sz="4" w:space="0" w:color="1D2A64"/>
+              <w:bottom w:val="single" w:sz="4" w:space="0" w:color="1D2A64"/>
+              <w:right w:val="single" w:sz="4" w:space="0" w:color="1D2A64"/>
+            </w:tcBorders>
+            <w:vAlign w:val="center"/>
           </w:tcPr>
           <w:p>
             <w:pPr>
@@ -83,8 +116,9 @@
               <w:rPr>
                 <w:rFonts w:ascii="Times New Roman" w:hAnsi="Times New Roman"/>
                 <w:b/>
+                <w:i w:val="0"/>
                 <w:color w:val="FFFFFF"/>
-                <w:sz w:val="24"/>
+                <w:sz w:val="21"/>
               </w:rPr>
               <w:t>TIẾT</w:t>
             </w:r>
@@ -92,8 +126,15 @@
         </w:tc>
         <w:tc>
           <w:tcPr>
-            <w:tcW w:type="dxa" w:w="1080"/>
-            <w:shd w:fill="1F497D"/>
+            <w:tcW w:type="dxa" w:w="2016"/>
+            <w:shd w:fill="1D2A64"/>
+            <w:tcBorders>
+              <w:top w:val="single" w:sz="4" w:space="0" w:color="1D2A64"/>
+              <w:left w:val="single" w:sz="4" w:space="0" w:color="1D2A64"/>
+              <w:bottom w:val="single" w:sz="4" w:space="0" w:color="1D2A64"/>
+              <w:right w:val="single" w:sz="4" w:space="0" w:color="1D2A64"/>
+            </w:tcBorders>
+            <w:vAlign w:val="center"/>
           </w:tcPr>
           <w:p>
             <w:pPr>
@@ -103,17 +144,25 @@
               <w:rPr>
                 <w:rFonts w:ascii="Times New Roman" w:hAnsi="Times New Roman"/>
                 <w:b/>
+                <w:i w:val="0"/>
                 <w:color w:val="FFFFFF"/>
-                <w:sz w:val="24"/>
+                <w:sz w:val="21"/>
               </w:rPr>
-              <w:t>THỨ 2</w:t>
+              <w:t>THỜI GIAN</w:t>
             </w:r>
           </w:p>
         </w:tc>
         <w:tc>
           <w:tcPr>
-            <w:tcW w:type="dxa" w:w="1080"/>
-            <w:shd w:fill="1F497D"/>
+            <w:tcW w:type="dxa" w:w="1872"/>
+            <w:shd w:fill="1D2A64"/>
+            <w:tcBorders>
+              <w:top w:val="single" w:sz="4" w:space="0" w:color="1D2A64"/>
+              <w:left w:val="single" w:sz="4" w:space="0" w:color="1D2A64"/>
+              <w:bottom w:val="single" w:sz="4" w:space="0" w:color="1D2A64"/>
+              <w:right w:val="single" w:sz="4" w:space="0" w:color="1D2A64"/>
+            </w:tcBorders>
+            <w:vAlign w:val="center"/>
           </w:tcPr>
           <w:p>
             <w:pPr>
@@ -123,17 +172,25 @@
               <w:rPr>
                 <w:rFonts w:ascii="Times New Roman" w:hAnsi="Times New Roman"/>
                 <w:b/>
+                <w:i w:val="0"/>
                 <w:color w:val="FFFFFF"/>
-                <w:sz w:val="24"/>
+                <w:sz w:val="21"/>
               </w:rPr>
-              <w:t>THỨ 3</w:t>
+              <w:t>THỨ 2</w:t>
             </w:r>
           </w:p>
         </w:tc>
         <w:tc>
           <w:tcPr>
-            <w:tcW w:type="dxa" w:w="1080"/>
-            <w:shd w:fill="1F497D"/>
+            <w:tcW w:type="dxa" w:w="1872"/>
+            <w:shd w:fill="1D2A64"/>
+            <w:tcBorders>
+              <w:top w:val="single" w:sz="4" w:space="0" w:color="1D2A64"/>
+              <w:left w:val="single" w:sz="4" w:space="0" w:color="1D2A64"/>
+              <w:bottom w:val="single" w:sz="4" w:space="0" w:color="1D2A64"/>
+              <w:right w:val="single" w:sz="4" w:space="0" w:color="1D2A64"/>
+            </w:tcBorders>
+            <w:vAlign w:val="center"/>
           </w:tcPr>
           <w:p>
             <w:pPr>
@@ -143,17 +200,25 @@
               <w:rPr>
                 <w:rFonts w:ascii="Times New Roman" w:hAnsi="Times New Roman"/>
                 <w:b/>
+                <w:i w:val="0"/>
                 <w:color w:val="FFFFFF"/>
-                <w:sz w:val="24"/>
+                <w:sz w:val="21"/>
               </w:rPr>
-              <w:t>THỨ 4</w:t>
+              <w:t>THỨ 3</w:t>
             </w:r>
           </w:p>
         </w:tc>
         <w:tc>
           <w:tcPr>
-            <w:tcW w:type="dxa" w:w="1080"/>
-            <w:shd w:fill="1F497D"/>
+            <w:tcW w:type="dxa" w:w="1872"/>
+            <w:shd w:fill="1D2A64"/>
+            <w:tcBorders>
+              <w:top w:val="single" w:sz="4" w:space="0" w:color="1D2A64"/>
+              <w:left w:val="single" w:sz="4" w:space="0" w:color="1D2A64"/>
+              <w:bottom w:val="single" w:sz="4" w:space="0" w:color="1D2A64"/>
+              <w:right w:val="single" w:sz="4" w:space="0" w:color="1D2A64"/>
+            </w:tcBorders>
+            <w:vAlign w:val="center"/>
           </w:tcPr>
           <w:p>
             <w:pPr>
@@ -163,17 +228,25 @@
               <w:rPr>
                 <w:rFonts w:ascii="Times New Roman" w:hAnsi="Times New Roman"/>
                 <w:b/>
+                <w:i w:val="0"/>
                 <w:color w:val="FFFFFF"/>
-                <w:sz w:val="24"/>
+                <w:sz w:val="21"/>
               </w:rPr>
-              <w:t>THỨ 5</w:t>
+              <w:t>THỨ 4</w:t>
             </w:r>
           </w:p>
         </w:tc>
         <w:tc>
           <w:tcPr>
-            <w:tcW w:type="dxa" w:w="1080"/>
-            <w:shd w:fill="1F497D"/>
+            <w:tcW w:type="dxa" w:w="1872"/>
+            <w:shd w:fill="1D2A64"/>
+            <w:tcBorders>
+              <w:top w:val="single" w:sz="4" w:space="0" w:color="1D2A64"/>
+              <w:left w:val="single" w:sz="4" w:space="0" w:color="1D2A64"/>
+              <w:bottom w:val="single" w:sz="4" w:space="0" w:color="1D2A64"/>
+              <w:right w:val="single" w:sz="4" w:space="0" w:color="1D2A64"/>
+            </w:tcBorders>
+            <w:vAlign w:val="center"/>
           </w:tcPr>
           <w:p>
             <w:pPr>
@@ -183,17 +256,25 @@
               <w:rPr>
                 <w:rFonts w:ascii="Times New Roman" w:hAnsi="Times New Roman"/>
                 <w:b/>
+                <w:i w:val="0"/>
                 <w:color w:val="FFFFFF"/>
-                <w:sz w:val="24"/>
+                <w:sz w:val="21"/>
               </w:rPr>
-              <w:t>THỨ 6</w:t>
+              <w:t>THỨ 5</w:t>
             </w:r>
           </w:p>
         </w:tc>
         <w:tc>
           <w:tcPr>
-            <w:tcW w:type="dxa" w:w="1080"/>
-            <w:shd w:fill="1F497D"/>
+            <w:tcW w:type="dxa" w:w="1872"/>
+            <w:shd w:fill="1D2A64"/>
+            <w:tcBorders>
+              <w:top w:val="single" w:sz="4" w:space="0" w:color="1D2A64"/>
+              <w:left w:val="single" w:sz="4" w:space="0" w:color="1D2A64"/>
+              <w:bottom w:val="single" w:sz="4" w:space="0" w:color="1D2A64"/>
+              <w:right w:val="single" w:sz="4" w:space="0" w:color="1D2A64"/>
+            </w:tcBorders>
+            <w:vAlign w:val="center"/>
           </w:tcPr>
           <w:p>
             <w:pPr>
@@ -203,8 +284,37 @@
               <w:rPr>
                 <w:rFonts w:ascii="Times New Roman" w:hAnsi="Times New Roman"/>
                 <w:b/>
+                <w:i w:val="0"/>
                 <w:color w:val="FFFFFF"/>
-                <w:sz w:val="24"/>
+                <w:sz w:val="21"/>
+              </w:rPr>
+              <w:t>THỨ 6</w:t>
+            </w:r>
+          </w:p>
+        </w:tc>
+        <w:tc>
+          <w:tcPr>
+            <w:tcW w:type="dxa" w:w="1296"/>
+            <w:shd w:fill="1D2A64"/>
+            <w:tcBorders>
+              <w:top w:val="single" w:sz="4" w:space="0" w:color="1D2A64"/>
+              <w:left w:val="single" w:sz="4" w:space="0" w:color="1D2A64"/>
+              <w:bottom w:val="single" w:sz="4" w:space="0" w:color="1D2A64"/>
+              <w:right w:val="single" w:sz="4" w:space="0" w:color="1D2A64"/>
+            </w:tcBorders>
+            <w:vAlign w:val="center"/>
+          </w:tcPr>
+          <w:p>
+            <w:pPr>
+              <w:jc w:val="center"/>
+            </w:pPr>
+            <w:r>
+              <w:rPr>
+                <w:rFonts w:ascii="Times New Roman" w:hAnsi="Times New Roman"/>
+                <w:b/>
+                <w:i w:val="0"/>
+                <w:color w:val="FFFFFF"/>
+                <w:sz w:val="21"/>
               </w:rPr>
               <w:t>THỨ 7</w:t>
             </w:r>
@@ -214,8 +324,16 @@
       <w:tr>
         <w:tc>
           <w:tcPr>
-            <w:tcW w:type="dxa" w:w="1080"/>
+            <w:tcW w:type="dxa" w:w="1296"/>
+            <w:vAlign w:val="center"/>
             <w:vMerge w:val="restart"/>
+            <w:tcBorders>
+              <w:top w:val="single" w:sz="4" w:space="0" w:color="CBD5E1"/>
+              <w:left w:val="single" w:sz="4" w:space="0" w:color="CBD5E1"/>
+              <w:bottom w:val="single" w:sz="4" w:space="0" w:color="CBD5E1"/>
+              <w:right w:val="single" w:sz="4" w:space="0" w:color="CBD5E1"/>
+            </w:tcBorders>
+            <w:shd w:fill="F1F5F9"/>
           </w:tcPr>
           <w:p>
             <w:pPr>
@@ -225,8 +343,9 @@
               <w:rPr>
                 <w:rFonts w:ascii="Times New Roman" w:hAnsi="Times New Roman"/>
                 <w:b/>
-                <w:color w:val="1F497D"/>
-                <w:sz w:val="26"/>
+                <w:i w:val="0"/>
+                <w:color w:val="1D2A64"/>
+                <w:sz w:val="22"/>
               </w:rPr>
               <w:t>SÁNG</w:t>
             </w:r>
@@ -234,42 +353,15 @@
         </w:tc>
         <w:tc>
           <w:tcPr>
-            <w:tcW w:type="dxa" w:w="1080"/>
-          </w:tcPr>
-          <w:p>
-            <w:pPr>
-              <w:jc w:val="center"/>
-            </w:pPr>
-            <w:r>
-              <w:rPr>
-                <w:rFonts w:ascii="Times New Roman" w:hAnsi="Times New Roman"/>
-              </w:rPr>
-              <w:t>Tiết 1</w:t>
-            </w:r>
-          </w:p>
-        </w:tc>
-        <w:tc>
-          <w:tcPr>
-            <w:tcW w:type="dxa" w:w="1080"/>
-          </w:tcPr>
-          <w:p/>
-        </w:tc>
-        <w:tc>
-          <w:tcPr>
-            <w:tcW w:type="dxa" w:w="1080"/>
-          </w:tcPr>
-          <w:p/>
-        </w:tc>
-        <w:tc>
-          <w:tcPr>
-            <w:tcW w:type="dxa" w:w="1080"/>
-          </w:tcPr>
-          <w:p/>
-        </w:tc>
-        <w:tc>
-          <w:tcPr>
-            <w:tcW w:type="dxa" w:w="1080"/>
-            <w:shd w:fill="D9E1F2"/>
+            <w:tcW w:type="dxa" w:w="1152"/>
+            <w:vAlign w:val="center"/>
+            <w:tcBorders>
+              <w:top w:val="single" w:sz="4" w:space="0" w:color="CBD5E1"/>
+              <w:left w:val="single" w:sz="4" w:space="0" w:color="CBD5E1"/>
+              <w:bottom w:val="single" w:sz="4" w:space="0" w:color="CBD5E1"/>
+              <w:right w:val="single" w:sz="4" w:space="0" w:color="CBD5E1"/>
+            </w:tcBorders>
+            <w:shd w:fill="FAFAFA"/>
           </w:tcPr>
           <w:p>
             <w:pPr>
@@ -279,65 +371,25 @@
               <w:rPr>
                 <w:rFonts w:ascii="Times New Roman" w:hAnsi="Times New Roman"/>
                 <w:b/>
-                <w:sz w:val="24"/>
+                <w:i w:val="0"/>
+                <w:color w:val="0F172A"/>
+                <w:sz w:val="20"/>
               </w:rPr>
-              <w:t>Tin - TT3</w:t>
+              <w:t>Tiết 1</w:t>
             </w:r>
           </w:p>
         </w:tc>
         <w:tc>
           <w:tcPr>
-            <w:tcW w:type="dxa" w:w="1080"/>
-          </w:tcPr>
-          <w:p/>
-        </w:tc>
-        <w:tc>
-          <w:tcPr>
-            <w:tcW w:type="dxa" w:w="1080"/>
-          </w:tcPr>
-          <w:p/>
-        </w:tc>
-      </w:tr>
-      <w:tr>
-        <w:tc>
-          <w:tcPr>
-            <w:tcW w:type="dxa" w:w="1080"/>
-            <w:vMerge/>
-          </w:tcPr>
-          <w:p/>
-        </w:tc>
-        <w:tc>
-          <w:tcPr>
-            <w:tcW w:type="dxa" w:w="1080"/>
-          </w:tcPr>
-          <w:p>
-            <w:pPr>
-              <w:jc w:val="center"/>
-            </w:pPr>
-            <w:r>
-              <w:rPr>
-                <w:rFonts w:ascii="Times New Roman" w:hAnsi="Times New Roman"/>
-              </w:rPr>
-              <w:t>Tiết 2</w:t>
-            </w:r>
-          </w:p>
-        </w:tc>
-        <w:tc>
-          <w:tcPr>
-            <w:tcW w:type="dxa" w:w="1080"/>
-          </w:tcPr>
-          <w:p/>
-        </w:tc>
-        <w:tc>
-          <w:tcPr>
-            <w:tcW w:type="dxa" w:w="1080"/>
-          </w:tcPr>
-          <w:p/>
-        </w:tc>
-        <w:tc>
-          <w:tcPr>
-            <w:tcW w:type="dxa" w:w="1080"/>
-            <w:shd w:fill="E2EFDA"/>
+            <w:tcW w:type="dxa" w:w="2016"/>
+            <w:vAlign w:val="center"/>
+            <w:tcBorders>
+              <w:top w:val="single" w:sz="4" w:space="0" w:color="CBD5E1"/>
+              <w:left w:val="single" w:sz="4" w:space="0" w:color="CBD5E1"/>
+              <w:bottom w:val="single" w:sz="4" w:space="0" w:color="CBD5E1"/>
+              <w:right w:val="single" w:sz="4" w:space="0" w:color="CBD5E1"/>
+            </w:tcBorders>
+            <w:shd w:fill="F8FAFC"/>
           </w:tcPr>
           <w:p>
             <w:pPr>
@@ -347,16 +399,108 @@
               <w:rPr>
                 <w:rFonts w:ascii="Times New Roman" w:hAnsi="Times New Roman"/>
                 <w:b/>
-                <w:sz w:val="24"/>
+                <w:i w:val="0"/>
+                <w:color w:val="334155"/>
+                <w:sz w:val="18"/>
               </w:rPr>
-              <w:t>Robotics - 3A1</w:t>
+              <w:t>08:15 - 08:50</w:t>
+              <w:br/>
+              <w:t>(08:05-08:50)</w:t>
             </w:r>
           </w:p>
         </w:tc>
         <w:tc>
           <w:tcPr>
-            <w:tcW w:type="dxa" w:w="1080"/>
-            <w:shd w:fill="E2EFDA"/>
+            <w:tcW w:type="dxa" w:w="1872"/>
+            <w:vAlign w:val="center"/>
+            <w:tcBorders>
+              <w:top w:val="single" w:sz="4" w:space="0" w:color="CBD5E1"/>
+              <w:left w:val="single" w:sz="4" w:space="0" w:color="CBD5E1"/>
+              <w:bottom w:val="single" w:sz="4" w:space="0" w:color="CBD5E1"/>
+              <w:right w:val="single" w:sz="4" w:space="0" w:color="CBD5E1"/>
+            </w:tcBorders>
+            <w:shd w:fill="FFFFFF"/>
+          </w:tcPr>
+          <w:p>
+            <w:pPr>
+              <w:jc w:val="center"/>
+            </w:pPr>
+            <w:r>
+              <w:rPr>
+                <w:rFonts w:ascii="Times New Roman" w:hAnsi="Times New Roman"/>
+                <w:b w:val="0"/>
+                <w:i w:val="0"/>
+                <w:color w:val="94A3B8"/>
+                <w:sz w:val="19"/>
+              </w:rPr>
+            </w:r>
+          </w:p>
+        </w:tc>
+        <w:tc>
+          <w:tcPr>
+            <w:tcW w:type="dxa" w:w="1872"/>
+            <w:vAlign w:val="center"/>
+            <w:tcBorders>
+              <w:top w:val="single" w:sz="4" w:space="0" w:color="CBD5E1"/>
+              <w:left w:val="single" w:sz="4" w:space="0" w:color="CBD5E1"/>
+              <w:bottom w:val="single" w:sz="4" w:space="0" w:color="CBD5E1"/>
+              <w:right w:val="single" w:sz="4" w:space="0" w:color="CBD5E1"/>
+            </w:tcBorders>
+            <w:shd w:fill="FFFFFF"/>
+          </w:tcPr>
+          <w:p>
+            <w:pPr>
+              <w:jc w:val="center"/>
+            </w:pPr>
+            <w:r>
+              <w:rPr>
+                <w:rFonts w:ascii="Times New Roman" w:hAnsi="Times New Roman"/>
+                <w:b w:val="0"/>
+                <w:i w:val="0"/>
+                <w:color w:val="94A3B8"/>
+                <w:sz w:val="19"/>
+              </w:rPr>
+            </w:r>
+          </w:p>
+        </w:tc>
+        <w:tc>
+          <w:tcPr>
+            <w:tcW w:type="dxa" w:w="1872"/>
+            <w:vAlign w:val="center"/>
+            <w:tcBorders>
+              <w:top w:val="single" w:sz="4" w:space="0" w:color="CBD5E1"/>
+              <w:left w:val="single" w:sz="4" w:space="0" w:color="CBD5E1"/>
+              <w:bottom w:val="single" w:sz="4" w:space="0" w:color="CBD5E1"/>
+              <w:right w:val="single" w:sz="4" w:space="0" w:color="CBD5E1"/>
+            </w:tcBorders>
+            <w:shd w:fill="FFFFFF"/>
+          </w:tcPr>
+          <w:p>
+            <w:pPr>
+              <w:jc w:val="center"/>
+            </w:pPr>
+            <w:r>
+              <w:rPr>
+                <w:rFonts w:ascii="Times New Roman" w:hAnsi="Times New Roman"/>
+                <w:b w:val="0"/>
+                <w:i w:val="0"/>
+                <w:color w:val="94A3B8"/>
+                <w:sz w:val="19"/>
+              </w:rPr>
+            </w:r>
+          </w:p>
+        </w:tc>
+        <w:tc>
+          <w:tcPr>
+            <w:tcW w:type="dxa" w:w="1872"/>
+            <w:vAlign w:val="center"/>
+            <w:tcBorders>
+              <w:top w:val="single" w:sz="4" w:space="0" w:color="CBD5E1"/>
+              <w:left w:val="single" w:sz="4" w:space="0" w:color="CBD5E1"/>
+              <w:bottom w:val="single" w:sz="4" w:space="0" w:color="CBD5E1"/>
+              <w:right w:val="single" w:sz="4" w:space="0" w:color="CBD5E1"/>
+            </w:tcBorders>
+            <w:shd w:fill="E0F2FE"/>
           </w:tcPr>
           <w:p>
             <w:pPr>
@@ -366,16 +510,96 @@
               <w:rPr>
                 <w:rFonts w:ascii="Times New Roman" w:hAnsi="Times New Roman"/>
                 <w:b/>
-                <w:sz w:val="24"/>
+                <w:i w:val="0"/>
+                <w:color w:val="0369A1"/>
+                <w:sz w:val="21"/>
               </w:rPr>
-              <w:t>Robotics - 1A1</w:t>
+              <w:t>Tin - TT3</w:t>
             </w:r>
           </w:p>
         </w:tc>
         <w:tc>
           <w:tcPr>
-            <w:tcW w:type="dxa" w:w="1080"/>
-            <w:shd w:fill="E2EFDA"/>
+            <w:tcW w:type="dxa" w:w="1872"/>
+            <w:vAlign w:val="center"/>
+            <w:tcBorders>
+              <w:top w:val="single" w:sz="4" w:space="0" w:color="CBD5E1"/>
+              <w:left w:val="single" w:sz="4" w:space="0" w:color="CBD5E1"/>
+              <w:bottom w:val="single" w:sz="4" w:space="0" w:color="CBD5E1"/>
+              <w:right w:val="single" w:sz="4" w:space="0" w:color="CBD5E1"/>
+            </w:tcBorders>
+            <w:shd w:fill="FFFFFF"/>
+          </w:tcPr>
+          <w:p>
+            <w:pPr>
+              <w:jc w:val="center"/>
+            </w:pPr>
+            <w:r>
+              <w:rPr>
+                <w:rFonts w:ascii="Times New Roman" w:hAnsi="Times New Roman"/>
+                <w:b w:val="0"/>
+                <w:i w:val="0"/>
+                <w:color w:val="94A3B8"/>
+                <w:sz w:val="19"/>
+              </w:rPr>
+            </w:r>
+          </w:p>
+        </w:tc>
+        <w:tc>
+          <w:tcPr>
+            <w:tcW w:type="dxa" w:w="1296"/>
+            <w:vAlign w:val="center"/>
+            <w:tcBorders>
+              <w:top w:val="single" w:sz="4" w:space="0" w:color="CBD5E1"/>
+              <w:left w:val="single" w:sz="4" w:space="0" w:color="CBD5E1"/>
+              <w:bottom w:val="single" w:sz="4" w:space="0" w:color="CBD5E1"/>
+              <w:right w:val="single" w:sz="4" w:space="0" w:color="CBD5E1"/>
+            </w:tcBorders>
+            <w:shd w:fill="FFFFFF"/>
+          </w:tcPr>
+          <w:p>
+            <w:pPr>
+              <w:jc w:val="center"/>
+            </w:pPr>
+            <w:r>
+              <w:rPr>
+                <w:rFonts w:ascii="Times New Roman" w:hAnsi="Times New Roman"/>
+                <w:b w:val="0"/>
+                <w:i w:val="0"/>
+                <w:color w:val="94A3B8"/>
+                <w:sz w:val="19"/>
+              </w:rPr>
+            </w:r>
+          </w:p>
+        </w:tc>
+      </w:tr>
+      <w:tr>
+        <w:tc>
+          <w:tcPr>
+            <w:tcW w:type="dxa" w:w="1296"/>
+            <w:vAlign w:val="center"/>
+            <w:vMerge/>
+            <w:tcBorders>
+              <w:top w:val="single" w:sz="4" w:space="0" w:color="CBD5E1"/>
+              <w:left w:val="single" w:sz="4" w:space="0" w:color="CBD5E1"/>
+              <w:bottom w:val="single" w:sz="4" w:space="0" w:color="CBD5E1"/>
+              <w:right w:val="single" w:sz="4" w:space="0" w:color="CBD5E1"/>
+            </w:tcBorders>
+            <w:shd w:fill="F1F5F9"/>
+          </w:tcPr>
+          <w:p/>
+        </w:tc>
+        <w:tc>
+          <w:tcPr>
+            <w:tcW w:type="dxa" w:w="1152"/>
+            <w:vAlign w:val="center"/>
+            <w:tcBorders>
+              <w:top w:val="single" w:sz="4" w:space="0" w:color="CBD5E1"/>
+              <w:left w:val="single" w:sz="4" w:space="0" w:color="CBD5E1"/>
+              <w:bottom w:val="single" w:sz="4" w:space="0" w:color="CBD5E1"/>
+              <w:right w:val="single" w:sz="4" w:space="0" w:color="CBD5E1"/>
+            </w:tcBorders>
+            <w:shd w:fill="FAFAFA"/>
           </w:tcPr>
           <w:p>
             <w:pPr>
@@ -385,47 +609,25 @@
               <w:rPr>
                 <w:rFonts w:ascii="Times New Roman" w:hAnsi="Times New Roman"/>
                 <w:b/>
-                <w:sz w:val="24"/>
+                <w:i w:val="0"/>
+                <w:color w:val="0F172A"/>
+                <w:sz w:val="20"/>
               </w:rPr>
-              <w:t>Robotics - 3C1</w:t>
+              <w:t>Tiết 2</w:t>
             </w:r>
           </w:p>
         </w:tc>
         <w:tc>
           <w:tcPr>
-            <w:tcW w:type="dxa" w:w="1080"/>
-          </w:tcPr>
-          <w:p/>
-        </w:tc>
-      </w:tr>
-      <w:tr>
-        <w:tc>
-          <w:tcPr>
-            <w:tcW w:type="dxa" w:w="1080"/>
-            <w:vMerge/>
-          </w:tcPr>
-          <w:p/>
-        </w:tc>
-        <w:tc>
-          <w:tcPr>
-            <w:tcW w:type="dxa" w:w="1080"/>
-          </w:tcPr>
-          <w:p>
-            <w:pPr>
-              <w:jc w:val="center"/>
-            </w:pPr>
-            <w:r>
-              <w:rPr>
-                <w:rFonts w:ascii="Times New Roman" w:hAnsi="Times New Roman"/>
-              </w:rPr>
-              <w:t>Tiết 3</w:t>
-            </w:r>
-          </w:p>
-        </w:tc>
-        <w:tc>
-          <w:tcPr>
-            <w:tcW w:type="dxa" w:w="1080"/>
-            <w:shd w:fill="D9E1F2"/>
+            <w:tcW w:type="dxa" w:w="2016"/>
+            <w:vAlign w:val="center"/>
+            <w:tcBorders>
+              <w:top w:val="single" w:sz="4" w:space="0" w:color="CBD5E1"/>
+              <w:left w:val="single" w:sz="4" w:space="0" w:color="CBD5E1"/>
+              <w:bottom w:val="single" w:sz="4" w:space="0" w:color="CBD5E1"/>
+              <w:right w:val="single" w:sz="4" w:space="0" w:color="CBD5E1"/>
+            </w:tcBorders>
+            <w:shd w:fill="F8FAFC"/>
           </w:tcPr>
           <w:p>
             <w:pPr>
@@ -435,16 +637,81 @@
               <w:rPr>
                 <w:rFonts w:ascii="Times New Roman" w:hAnsi="Times New Roman"/>
                 <w:b/>
-                <w:sz w:val="24"/>
+                <w:i w:val="0"/>
+                <w:color w:val="334155"/>
+                <w:sz w:val="18"/>
               </w:rPr>
-              <w:t>Tin - 7A1</w:t>
+              <w:t>08:55 - 09:30</w:t>
+              <w:br/>
+              <w:t>(08:55-09:40)</w:t>
             </w:r>
           </w:p>
         </w:tc>
         <w:tc>
           <w:tcPr>
-            <w:tcW w:type="dxa" w:w="1080"/>
-            <w:shd w:fill="D9E1F2"/>
+            <w:tcW w:type="dxa" w:w="1872"/>
+            <w:vAlign w:val="center"/>
+            <w:tcBorders>
+              <w:top w:val="single" w:sz="4" w:space="0" w:color="CBD5E1"/>
+              <w:left w:val="single" w:sz="4" w:space="0" w:color="CBD5E1"/>
+              <w:bottom w:val="single" w:sz="4" w:space="0" w:color="CBD5E1"/>
+              <w:right w:val="single" w:sz="4" w:space="0" w:color="CBD5E1"/>
+            </w:tcBorders>
+            <w:shd w:fill="FFFFFF"/>
+          </w:tcPr>
+          <w:p>
+            <w:pPr>
+              <w:jc w:val="center"/>
+            </w:pPr>
+            <w:r>
+              <w:rPr>
+                <w:rFonts w:ascii="Times New Roman" w:hAnsi="Times New Roman"/>
+                <w:b w:val="0"/>
+                <w:i w:val="0"/>
+                <w:color w:val="94A3B8"/>
+                <w:sz w:val="19"/>
+              </w:rPr>
+            </w:r>
+          </w:p>
+        </w:tc>
+        <w:tc>
+          <w:tcPr>
+            <w:tcW w:type="dxa" w:w="1872"/>
+            <w:vAlign w:val="center"/>
+            <w:tcBorders>
+              <w:top w:val="single" w:sz="4" w:space="0" w:color="CBD5E1"/>
+              <w:left w:val="single" w:sz="4" w:space="0" w:color="CBD5E1"/>
+              <w:bottom w:val="single" w:sz="4" w:space="0" w:color="CBD5E1"/>
+              <w:right w:val="single" w:sz="4" w:space="0" w:color="CBD5E1"/>
+            </w:tcBorders>
+            <w:shd w:fill="FFFFFF"/>
+          </w:tcPr>
+          <w:p>
+            <w:pPr>
+              <w:jc w:val="center"/>
+            </w:pPr>
+            <w:r>
+              <w:rPr>
+                <w:rFonts w:ascii="Times New Roman" w:hAnsi="Times New Roman"/>
+                <w:b w:val="0"/>
+                <w:i w:val="0"/>
+                <w:color w:val="94A3B8"/>
+                <w:sz w:val="19"/>
+              </w:rPr>
+            </w:r>
+          </w:p>
+        </w:tc>
+        <w:tc>
+          <w:tcPr>
+            <w:tcW w:type="dxa" w:w="1872"/>
+            <w:vAlign w:val="center"/>
+            <w:tcBorders>
+              <w:top w:val="single" w:sz="4" w:space="0" w:color="CBD5E1"/>
+              <w:left w:val="single" w:sz="4" w:space="0" w:color="CBD5E1"/>
+              <w:bottom w:val="single" w:sz="4" w:space="0" w:color="CBD5E1"/>
+              <w:right w:val="single" w:sz="4" w:space="0" w:color="CBD5E1"/>
+            </w:tcBorders>
+            <w:shd w:fill="FEF3C7"/>
           </w:tcPr>
           <w:p>
             <w:pPr>
@@ -454,28 +721,25 @@
               <w:rPr>
                 <w:rFonts w:ascii="Times New Roman" w:hAnsi="Times New Roman"/>
                 <w:b/>
-                <w:sz w:val="24"/>
+                <w:i w:val="0"/>
+                <w:color w:val="B45309"/>
+                <w:sz w:val="21"/>
               </w:rPr>
-              <w:t>Tin - 5C1</w:t>
+              <w:t>Robotics - 3A1</w:t>
             </w:r>
           </w:p>
         </w:tc>
         <w:tc>
           <w:tcPr>
-            <w:tcW w:type="dxa" w:w="1080"/>
-          </w:tcPr>
-          <w:p/>
-        </w:tc>
-        <w:tc>
-          <w:tcPr>
-            <w:tcW w:type="dxa" w:w="1080"/>
-          </w:tcPr>
-          <w:p/>
-        </w:tc>
-        <w:tc>
-          <w:tcPr>
-            <w:tcW w:type="dxa" w:w="1080"/>
-            <w:shd w:fill="D9E1F2"/>
+            <w:tcW w:type="dxa" w:w="1872"/>
+            <w:vAlign w:val="center"/>
+            <w:tcBorders>
+              <w:top w:val="single" w:sz="4" w:space="0" w:color="CBD5E1"/>
+              <w:left w:val="single" w:sz="4" w:space="0" w:color="CBD5E1"/>
+              <w:bottom w:val="single" w:sz="4" w:space="0" w:color="CBD5E1"/>
+              <w:right w:val="single" w:sz="4" w:space="0" w:color="CBD5E1"/>
+            </w:tcBorders>
+            <w:shd w:fill="FEF3C7"/>
           </w:tcPr>
           <w:p>
             <w:pPr>
@@ -485,47 +749,25 @@
               <w:rPr>
                 <w:rFonts w:ascii="Times New Roman" w:hAnsi="Times New Roman"/>
                 <w:b/>
-                <w:sz w:val="24"/>
+                <w:i w:val="0"/>
+                <w:color w:val="B45309"/>
+                <w:sz w:val="21"/>
               </w:rPr>
-              <w:t>Tin - 2C1</w:t>
+              <w:t>Robotics - 1A1</w:t>
             </w:r>
           </w:p>
         </w:tc>
         <w:tc>
           <w:tcPr>
-            <w:tcW w:type="dxa" w:w="1080"/>
-          </w:tcPr>
-          <w:p/>
-        </w:tc>
-      </w:tr>
-      <w:tr>
-        <w:tc>
-          <w:tcPr>
-            <w:tcW w:type="dxa" w:w="1080"/>
-            <w:vMerge/>
-          </w:tcPr>
-          <w:p/>
-        </w:tc>
-        <w:tc>
-          <w:tcPr>
-            <w:tcW w:type="dxa" w:w="1080"/>
-          </w:tcPr>
-          <w:p>
-            <w:pPr>
-              <w:jc w:val="center"/>
-            </w:pPr>
-            <w:r>
-              <w:rPr>
-                <w:rFonts w:ascii="Times New Roman" w:hAnsi="Times New Roman"/>
-              </w:rPr>
-              <w:t>Tiết 4</w:t>
-            </w:r>
-          </w:p>
-        </w:tc>
-        <w:tc>
-          <w:tcPr>
-            <w:tcW w:type="dxa" w:w="1080"/>
-            <w:shd w:fill="D9E1F2"/>
+            <w:tcW w:type="dxa" w:w="1872"/>
+            <w:vAlign w:val="center"/>
+            <w:tcBorders>
+              <w:top w:val="single" w:sz="4" w:space="0" w:color="CBD5E1"/>
+              <w:left w:val="single" w:sz="4" w:space="0" w:color="CBD5E1"/>
+              <w:bottom w:val="single" w:sz="4" w:space="0" w:color="CBD5E1"/>
+              <w:right w:val="single" w:sz="4" w:space="0" w:color="CBD5E1"/>
+            </w:tcBorders>
+            <w:shd w:fill="FEF3C7"/>
           </w:tcPr>
           <w:p>
             <w:pPr>
@@ -535,16 +777,69 @@
               <w:rPr>
                 <w:rFonts w:ascii="Times New Roman" w:hAnsi="Times New Roman"/>
                 <w:b/>
-                <w:sz w:val="24"/>
+                <w:i w:val="0"/>
+                <w:color w:val="B45309"/>
+                <w:sz w:val="21"/>
               </w:rPr>
-              <w:t>Tin - 1A1</w:t>
+              <w:t>Robotics - 3C1</w:t>
             </w:r>
           </w:p>
         </w:tc>
         <w:tc>
           <w:tcPr>
-            <w:tcW w:type="dxa" w:w="1080"/>
-            <w:shd w:fill="E2EFDA"/>
+            <w:tcW w:type="dxa" w:w="1296"/>
+            <w:vAlign w:val="center"/>
+            <w:tcBorders>
+              <w:top w:val="single" w:sz="4" w:space="0" w:color="CBD5E1"/>
+              <w:left w:val="single" w:sz="4" w:space="0" w:color="CBD5E1"/>
+              <w:bottom w:val="single" w:sz="4" w:space="0" w:color="CBD5E1"/>
+              <w:right w:val="single" w:sz="4" w:space="0" w:color="CBD5E1"/>
+            </w:tcBorders>
+            <w:shd w:fill="FFFFFF"/>
+          </w:tcPr>
+          <w:p>
+            <w:pPr>
+              <w:jc w:val="center"/>
+            </w:pPr>
+            <w:r>
+              <w:rPr>
+                <w:rFonts w:ascii="Times New Roman" w:hAnsi="Times New Roman"/>
+                <w:b w:val="0"/>
+                <w:i w:val="0"/>
+                <w:color w:val="94A3B8"/>
+                <w:sz w:val="19"/>
+              </w:rPr>
+            </w:r>
+          </w:p>
+        </w:tc>
+      </w:tr>
+      <w:tr>
+        <w:tc>
+          <w:tcPr>
+            <w:tcW w:type="dxa" w:w="1296"/>
+            <w:vAlign w:val="center"/>
+            <w:vMerge/>
+            <w:tcBorders>
+              <w:top w:val="single" w:sz="4" w:space="0" w:color="CBD5E1"/>
+              <w:left w:val="single" w:sz="4" w:space="0" w:color="CBD5E1"/>
+              <w:bottom w:val="single" w:sz="4" w:space="0" w:color="CBD5E1"/>
+              <w:right w:val="single" w:sz="4" w:space="0" w:color="CBD5E1"/>
+            </w:tcBorders>
+            <w:shd w:fill="F1F5F9"/>
+          </w:tcPr>
+          <w:p/>
+        </w:tc>
+        <w:tc>
+          <w:tcPr>
+            <w:tcW w:type="dxa" w:w="1152"/>
+            <w:vAlign w:val="center"/>
+            <w:tcBorders>
+              <w:top w:val="single" w:sz="4" w:space="0" w:color="CBD5E1"/>
+              <w:left w:val="single" w:sz="4" w:space="0" w:color="CBD5E1"/>
+              <w:bottom w:val="single" w:sz="4" w:space="0" w:color="CBD5E1"/>
+              <w:right w:val="single" w:sz="4" w:space="0" w:color="CBD5E1"/>
+            </w:tcBorders>
+            <w:shd w:fill="FAFAFA"/>
           </w:tcPr>
           <w:p>
             <w:pPr>
@@ -554,16 +849,25 @@
               <w:rPr>
                 <w:rFonts w:ascii="Times New Roman" w:hAnsi="Times New Roman"/>
                 <w:b/>
-                <w:sz w:val="24"/>
+                <w:i w:val="0"/>
+                <w:color w:val="0F172A"/>
+                <w:sz w:val="20"/>
               </w:rPr>
-              <w:t>Robotics - 5C1</w:t>
+              <w:t>Tiết 3</w:t>
             </w:r>
           </w:p>
         </w:tc>
         <w:tc>
           <w:tcPr>
-            <w:tcW w:type="dxa" w:w="1080"/>
-            <w:shd w:fill="D9E1F2"/>
+            <w:tcW w:type="dxa" w:w="2016"/>
+            <w:vAlign w:val="center"/>
+            <w:tcBorders>
+              <w:top w:val="single" w:sz="4" w:space="0" w:color="CBD5E1"/>
+              <w:left w:val="single" w:sz="4" w:space="0" w:color="CBD5E1"/>
+              <w:bottom w:val="single" w:sz="4" w:space="0" w:color="CBD5E1"/>
+              <w:right w:val="single" w:sz="4" w:space="0" w:color="CBD5E1"/>
+            </w:tcBorders>
+            <w:shd w:fill="F8FAFC"/>
           </w:tcPr>
           <w:p>
             <w:pPr>
@@ -573,16 +877,27 @@
               <w:rPr>
                 <w:rFonts w:ascii="Times New Roman" w:hAnsi="Times New Roman"/>
                 <w:b/>
-                <w:sz w:val="24"/>
+                <w:i w:val="0"/>
+                <w:color w:val="334155"/>
+                <w:sz w:val="18"/>
               </w:rPr>
-              <w:t>Tin - 3C1</w:t>
+              <w:t>09:45 - 10:20</w:t>
+              <w:br/>
+              <w:t>(09:45-10:25)</w:t>
             </w:r>
           </w:p>
         </w:tc>
         <w:tc>
           <w:tcPr>
-            <w:tcW w:type="dxa" w:w="1080"/>
-            <w:shd w:fill="E2EFDA"/>
+            <w:tcW w:type="dxa" w:w="1872"/>
+            <w:vAlign w:val="center"/>
+            <w:tcBorders>
+              <w:top w:val="single" w:sz="4" w:space="0" w:color="CBD5E1"/>
+              <w:left w:val="single" w:sz="4" w:space="0" w:color="CBD5E1"/>
+              <w:bottom w:val="single" w:sz="4" w:space="0" w:color="CBD5E1"/>
+              <w:right w:val="single" w:sz="4" w:space="0" w:color="CBD5E1"/>
+            </w:tcBorders>
+            <w:shd w:fill="E0F2FE"/>
           </w:tcPr>
           <w:p>
             <w:pPr>
@@ -592,16 +907,25 @@
               <w:rPr>
                 <w:rFonts w:ascii="Times New Roman" w:hAnsi="Times New Roman"/>
                 <w:b/>
-                <w:sz w:val="24"/>
+                <w:i w:val="0"/>
+                <w:color w:val="0369A1"/>
+                <w:sz w:val="21"/>
               </w:rPr>
-              <w:t>Robotics - 2C1</w:t>
+              <w:t>Tin - 7A1</w:t>
             </w:r>
           </w:p>
         </w:tc>
         <w:tc>
           <w:tcPr>
-            <w:tcW w:type="dxa" w:w="1080"/>
-            <w:shd w:fill="D9E1F2"/>
+            <w:tcW w:type="dxa" w:w="1872"/>
+            <w:vAlign w:val="center"/>
+            <w:tcBorders>
+              <w:top w:val="single" w:sz="4" w:space="0" w:color="CBD5E1"/>
+              <w:left w:val="single" w:sz="4" w:space="0" w:color="CBD5E1"/>
+              <w:bottom w:val="single" w:sz="4" w:space="0" w:color="CBD5E1"/>
+              <w:right w:val="single" w:sz="4" w:space="0" w:color="CBD5E1"/>
+            </w:tcBorders>
+            <w:shd w:fill="E0F2FE"/>
           </w:tcPr>
           <w:p>
             <w:pPr>
@@ -611,30 +935,25 @@
               <w:rPr>
                 <w:rFonts w:ascii="Times New Roman" w:hAnsi="Times New Roman"/>
                 <w:b/>
-                <w:sz w:val="24"/>
+                <w:i w:val="0"/>
+                <w:color w:val="0369A1"/>
+                <w:sz w:val="21"/>
               </w:rPr>
-              <w:t>Tin - 6A1</w:t>
+              <w:t>Tin - 5C1</w:t>
             </w:r>
           </w:p>
         </w:tc>
         <w:tc>
           <w:tcPr>
-            <w:tcW w:type="dxa" w:w="1080"/>
-          </w:tcPr>
-          <w:p/>
-        </w:tc>
-      </w:tr>
-      <w:tr>
-        <w:tc>
-          <w:tcPr>
-            <w:tcW w:type="dxa" w:w="1080"/>
-            <w:vMerge/>
-          </w:tcPr>
-          <w:p/>
-        </w:tc>
-        <w:tc>
-          <w:tcPr>
-            <w:tcW w:type="dxa" w:w="1080"/>
+            <w:tcW w:type="dxa" w:w="1872"/>
+            <w:vAlign w:val="center"/>
+            <w:tcBorders>
+              <w:top w:val="single" w:sz="4" w:space="0" w:color="CBD5E1"/>
+              <w:left w:val="single" w:sz="4" w:space="0" w:color="CBD5E1"/>
+              <w:bottom w:val="single" w:sz="4" w:space="0" w:color="CBD5E1"/>
+              <w:right w:val="single" w:sz="4" w:space="0" w:color="CBD5E1"/>
+            </w:tcBorders>
+            <w:shd w:fill="FFFFFF"/>
           </w:tcPr>
           <w:p>
             <w:pPr>
@@ -643,39 +962,52 @@
             <w:r>
               <w:rPr>
                 <w:rFonts w:ascii="Times New Roman" w:hAnsi="Times New Roman"/>
+                <w:b w:val="0"/>
+                <w:i w:val="0"/>
+                <w:color w:val="94A3B8"/>
+                <w:sz w:val="19"/>
               </w:rPr>
-              <w:t>Tiết 5</w:t>
             </w:r>
           </w:p>
         </w:tc>
         <w:tc>
           <w:tcPr>
-            <w:tcW w:type="dxa" w:w="1080"/>
+            <w:tcW w:type="dxa" w:w="1872"/>
+            <w:vAlign w:val="center"/>
+            <w:tcBorders>
+              <w:top w:val="single" w:sz="4" w:space="0" w:color="CBD5E1"/>
+              <w:left w:val="single" w:sz="4" w:space="0" w:color="CBD5E1"/>
+              <w:bottom w:val="single" w:sz="4" w:space="0" w:color="CBD5E1"/>
+              <w:right w:val="single" w:sz="4" w:space="0" w:color="CBD5E1"/>
+            </w:tcBorders>
+            <w:shd w:fill="FFFFFF"/>
           </w:tcPr>
-          <w:p/>
+          <w:p>
+            <w:pPr>
+              <w:jc w:val="center"/>
+            </w:pPr>
+            <w:r>
+              <w:rPr>
+                <w:rFonts w:ascii="Times New Roman" w:hAnsi="Times New Roman"/>
+                <w:b w:val="0"/>
+                <w:i w:val="0"/>
+                <w:color w:val="94A3B8"/>
+                <w:sz w:val="19"/>
+              </w:rPr>
+            </w:r>
+          </w:p>
         </w:tc>
         <w:tc>
           <w:tcPr>
-            <w:tcW w:type="dxa" w:w="1080"/>
-          </w:tcPr>
-          <w:p/>
-        </w:tc>
-        <w:tc>
-          <w:tcPr>
-            <w:tcW w:type="dxa" w:w="1080"/>
-          </w:tcPr>
-          <w:p/>
-        </w:tc>
-        <w:tc>
-          <w:tcPr>
-            <w:tcW w:type="dxa" w:w="1080"/>
-          </w:tcPr>
-          <w:p/>
-        </w:tc>
-        <w:tc>
-          <w:tcPr>
-            <w:tcW w:type="dxa" w:w="1080"/>
-            <w:shd w:fill="E2EFDA"/>
+            <w:tcW w:type="dxa" w:w="1872"/>
+            <w:vAlign w:val="center"/>
+            <w:tcBorders>
+              <w:top w:val="single" w:sz="4" w:space="0" w:color="CBD5E1"/>
+              <w:left w:val="single" w:sz="4" w:space="0" w:color="CBD5E1"/>
+              <w:bottom w:val="single" w:sz="4" w:space="0" w:color="CBD5E1"/>
+              <w:right w:val="single" w:sz="4" w:space="0" w:color="CBD5E1"/>
+            </w:tcBorders>
+            <w:shd w:fill="E0F2FE"/>
           </w:tcPr>
           <w:p>
             <w:pPr>
@@ -685,24 +1017,69 @@
               <w:rPr>
                 <w:rFonts w:ascii="Times New Roman" w:hAnsi="Times New Roman"/>
                 <w:b/>
-                <w:sz w:val="24"/>
+                <w:i w:val="0"/>
+                <w:color w:val="0369A1"/>
+                <w:sz w:val="21"/>
               </w:rPr>
-              <w:t>Robotics - 6A1</w:t>
+              <w:t>Tin - 2C1</w:t>
             </w:r>
           </w:p>
         </w:tc>
         <w:tc>
           <w:tcPr>
-            <w:tcW w:type="dxa" w:w="1080"/>
+            <w:tcW w:type="dxa" w:w="1296"/>
+            <w:vAlign w:val="center"/>
+            <w:tcBorders>
+              <w:top w:val="single" w:sz="4" w:space="0" w:color="CBD5E1"/>
+              <w:left w:val="single" w:sz="4" w:space="0" w:color="CBD5E1"/>
+              <w:bottom w:val="single" w:sz="4" w:space="0" w:color="CBD5E1"/>
+              <w:right w:val="single" w:sz="4" w:space="0" w:color="CBD5E1"/>
+            </w:tcBorders>
+            <w:shd w:fill="FFFFFF"/>
           </w:tcPr>
-          <w:p/>
+          <w:p>
+            <w:pPr>
+              <w:jc w:val="center"/>
+            </w:pPr>
+            <w:r>
+              <w:rPr>
+                <w:rFonts w:ascii="Times New Roman" w:hAnsi="Times New Roman"/>
+                <w:b w:val="0"/>
+                <w:i w:val="0"/>
+                <w:color w:val="94A3B8"/>
+                <w:sz w:val="19"/>
+              </w:rPr>
+            </w:r>
+          </w:p>
         </w:tc>
       </w:tr>
       <w:tr>
         <w:tc>
           <w:tcPr>
-            <w:tcW w:type="dxa" w:w="1080"/>
-            <w:vMerge w:val="restart"/>
+            <w:tcW w:type="dxa" w:w="1296"/>
+            <w:vAlign w:val="center"/>
+            <w:vMerge/>
+            <w:tcBorders>
+              <w:top w:val="single" w:sz="4" w:space="0" w:color="CBD5E1"/>
+              <w:left w:val="single" w:sz="4" w:space="0" w:color="CBD5E1"/>
+              <w:bottom w:val="single" w:sz="4" w:space="0" w:color="CBD5E1"/>
+              <w:right w:val="single" w:sz="4" w:space="0" w:color="CBD5E1"/>
+            </w:tcBorders>
+            <w:shd w:fill="F1F5F9"/>
+          </w:tcPr>
+          <w:p/>
+        </w:tc>
+        <w:tc>
+          <w:tcPr>
+            <w:tcW w:type="dxa" w:w="1152"/>
+            <w:vAlign w:val="center"/>
+            <w:tcBorders>
+              <w:top w:val="single" w:sz="4" w:space="0" w:color="CBD5E1"/>
+              <w:left w:val="single" w:sz="4" w:space="0" w:color="CBD5E1"/>
+              <w:bottom w:val="single" w:sz="4" w:space="0" w:color="CBD5E1"/>
+              <w:right w:val="single" w:sz="4" w:space="0" w:color="CBD5E1"/>
+            </w:tcBorders>
+            <w:shd w:fill="FAFAFA"/>
           </w:tcPr>
           <w:p>
             <w:pPr>
@@ -712,39 +1089,25 @@
               <w:rPr>
                 <w:rFonts w:ascii="Times New Roman" w:hAnsi="Times New Roman"/>
                 <w:b/>
-                <w:color w:val="1F497D"/>
-                <w:sz w:val="26"/>
+                <w:i w:val="0"/>
+                <w:color w:val="0F172A"/>
+                <w:sz w:val="20"/>
               </w:rPr>
-              <w:t>CHIỀU</w:t>
+              <w:t>Tiết 4</w:t>
             </w:r>
           </w:p>
         </w:tc>
         <w:tc>
           <w:tcPr>
-            <w:tcW w:type="dxa" w:w="1080"/>
-          </w:tcPr>
-          <w:p>
-            <w:pPr>
-              <w:jc w:val="center"/>
-            </w:pPr>
-            <w:r>
-              <w:rPr>
-                <w:rFonts w:ascii="Times New Roman" w:hAnsi="Times New Roman"/>
-              </w:rPr>
-              <w:t>Tiết 1</w:t>
-            </w:r>
-          </w:p>
-        </w:tc>
-        <w:tc>
-          <w:tcPr>
-            <w:tcW w:type="dxa" w:w="1080"/>
-          </w:tcPr>
-          <w:p/>
-        </w:tc>
-        <w:tc>
-          <w:tcPr>
-            <w:tcW w:type="dxa" w:w="1080"/>
-            <w:shd w:fill="D9E1F2"/>
+            <w:tcW w:type="dxa" w:w="2016"/>
+            <w:vAlign w:val="center"/>
+            <w:tcBorders>
+              <w:top w:val="single" w:sz="4" w:space="0" w:color="CBD5E1"/>
+              <w:left w:val="single" w:sz="4" w:space="0" w:color="CBD5E1"/>
+              <w:bottom w:val="single" w:sz="4" w:space="0" w:color="CBD5E1"/>
+              <w:right w:val="single" w:sz="4" w:space="0" w:color="CBD5E1"/>
+            </w:tcBorders>
+            <w:shd w:fill="F8FAFC"/>
           </w:tcPr>
           <w:p>
             <w:pPr>
@@ -754,22 +1117,27 @@
               <w:rPr>
                 <w:rFonts w:ascii="Times New Roman" w:hAnsi="Times New Roman"/>
                 <w:b/>
-                <w:sz w:val="24"/>
+                <w:i w:val="0"/>
+                <w:color w:val="334155"/>
+                <w:sz w:val="18"/>
               </w:rPr>
-              <w:t>Tin - 2A1</w:t>
+              <w:t>10:25 - 11:00</w:t>
+              <w:br/>
+              <w:t>(10:30-11:10)</w:t>
             </w:r>
           </w:p>
         </w:tc>
         <w:tc>
           <w:tcPr>
-            <w:tcW w:type="dxa" w:w="1080"/>
-          </w:tcPr>
-          <w:p/>
-        </w:tc>
-        <w:tc>
-          <w:tcPr>
-            <w:tcW w:type="dxa" w:w="1080"/>
-            <w:shd w:fill="D9E1F2"/>
+            <w:tcW w:type="dxa" w:w="1872"/>
+            <w:vAlign w:val="center"/>
+            <w:tcBorders>
+              <w:top w:val="single" w:sz="4" w:space="0" w:color="CBD5E1"/>
+              <w:left w:val="single" w:sz="4" w:space="0" w:color="CBD5E1"/>
+              <w:bottom w:val="single" w:sz="4" w:space="0" w:color="CBD5E1"/>
+              <w:right w:val="single" w:sz="4" w:space="0" w:color="CBD5E1"/>
+            </w:tcBorders>
+            <w:shd w:fill="E0F2FE"/>
           </w:tcPr>
           <w:p>
             <w:pPr>
@@ -779,16 +1147,25 @@
               <w:rPr>
                 <w:rFonts w:ascii="Times New Roman" w:hAnsi="Times New Roman"/>
                 <w:b/>
-                <w:sz w:val="24"/>
+                <w:i w:val="0"/>
+                <w:color w:val="0369A1"/>
+                <w:sz w:val="21"/>
               </w:rPr>
-              <w:t>Tin - 3A1</w:t>
+              <w:t>Tin - 1A1</w:t>
             </w:r>
           </w:p>
         </w:tc>
         <w:tc>
           <w:tcPr>
-            <w:tcW w:type="dxa" w:w="1080"/>
-            <w:shd w:fill="D9E1F2"/>
+            <w:tcW w:type="dxa" w:w="1872"/>
+            <w:vAlign w:val="center"/>
+            <w:tcBorders>
+              <w:top w:val="single" w:sz="4" w:space="0" w:color="CBD5E1"/>
+              <w:left w:val="single" w:sz="4" w:space="0" w:color="CBD5E1"/>
+              <w:bottom w:val="single" w:sz="4" w:space="0" w:color="CBD5E1"/>
+              <w:right w:val="single" w:sz="4" w:space="0" w:color="CBD5E1"/>
+            </w:tcBorders>
+            <w:shd w:fill="FEF3C7"/>
           </w:tcPr>
           <w:p>
             <w:pPr>
@@ -798,53 +1175,25 @@
               <w:rPr>
                 <w:rFonts w:ascii="Times New Roman" w:hAnsi="Times New Roman"/>
                 <w:b/>
-                <w:sz w:val="24"/>
+                <w:i w:val="0"/>
+                <w:color w:val="B45309"/>
+                <w:sz w:val="21"/>
               </w:rPr>
-              <w:t>Tin - 8A1</w:t>
+              <w:t>Robotics - 5C1</w:t>
             </w:r>
           </w:p>
         </w:tc>
         <w:tc>
           <w:tcPr>
-            <w:tcW w:type="dxa" w:w="1080"/>
-          </w:tcPr>
-          <w:p/>
-        </w:tc>
-      </w:tr>
-      <w:tr>
-        <w:tc>
-          <w:tcPr>
-            <w:tcW w:type="dxa" w:w="1080"/>
-            <w:vMerge/>
-          </w:tcPr>
-          <w:p/>
-        </w:tc>
-        <w:tc>
-          <w:tcPr>
-            <w:tcW w:type="dxa" w:w="1080"/>
-          </w:tcPr>
-          <w:p>
-            <w:pPr>
-              <w:jc w:val="center"/>
-            </w:pPr>
-            <w:r>
-              <w:rPr>
-                <w:rFonts w:ascii="Times New Roman" w:hAnsi="Times New Roman"/>
-              </w:rPr>
-              <w:t>Tiết 2</w:t>
-            </w:r>
-          </w:p>
-        </w:tc>
-        <w:tc>
-          <w:tcPr>
-            <w:tcW w:type="dxa" w:w="1080"/>
-          </w:tcPr>
-          <w:p/>
-        </w:tc>
-        <w:tc>
-          <w:tcPr>
-            <w:tcW w:type="dxa" w:w="1080"/>
-            <w:shd w:fill="D9E1F2"/>
+            <w:tcW w:type="dxa" w:w="1872"/>
+            <w:vAlign w:val="center"/>
+            <w:tcBorders>
+              <w:top w:val="single" w:sz="4" w:space="0" w:color="CBD5E1"/>
+              <w:left w:val="single" w:sz="4" w:space="0" w:color="CBD5E1"/>
+              <w:bottom w:val="single" w:sz="4" w:space="0" w:color="CBD5E1"/>
+              <w:right w:val="single" w:sz="4" w:space="0" w:color="CBD5E1"/>
+            </w:tcBorders>
+            <w:shd w:fill="E0F2FE"/>
           </w:tcPr>
           <w:p>
             <w:pPr>
@@ -854,22 +1203,25 @@
               <w:rPr>
                 <w:rFonts w:ascii="Times New Roman" w:hAnsi="Times New Roman"/>
                 <w:b/>
-                <w:sz w:val="24"/>
+                <w:i w:val="0"/>
+                <w:color w:val="0369A1"/>
+                <w:sz w:val="21"/>
               </w:rPr>
-              <w:t>Tin - 1C1</w:t>
+              <w:t>Tin - 3C1</w:t>
             </w:r>
           </w:p>
         </w:tc>
         <w:tc>
           <w:tcPr>
-            <w:tcW w:type="dxa" w:w="1080"/>
-          </w:tcPr>
-          <w:p/>
-        </w:tc>
-        <w:tc>
-          <w:tcPr>
-            <w:tcW w:type="dxa" w:w="1080"/>
-            <w:shd w:fill="D9E1F2"/>
+            <w:tcW w:type="dxa" w:w="1872"/>
+            <w:vAlign w:val="center"/>
+            <w:tcBorders>
+              <w:top w:val="single" w:sz="4" w:space="0" w:color="CBD5E1"/>
+              <w:left w:val="single" w:sz="4" w:space="0" w:color="CBD5E1"/>
+              <w:bottom w:val="single" w:sz="4" w:space="0" w:color="CBD5E1"/>
+              <w:right w:val="single" w:sz="4" w:space="0" w:color="CBD5E1"/>
+            </w:tcBorders>
+            <w:shd w:fill="FEF3C7"/>
           </w:tcPr>
           <w:p>
             <w:pPr>
@@ -879,16 +1231,25 @@
               <w:rPr>
                 <w:rFonts w:ascii="Times New Roman" w:hAnsi="Times New Roman"/>
                 <w:b/>
-                <w:sz w:val="24"/>
+                <w:i w:val="0"/>
+                <w:color w:val="B45309"/>
+                <w:sz w:val="21"/>
               </w:rPr>
-              <w:t>Tin - TTH 1</w:t>
+              <w:t>Robotics - 2C1</w:t>
             </w:r>
           </w:p>
         </w:tc>
         <w:tc>
           <w:tcPr>
-            <w:tcW w:type="dxa" w:w="1080"/>
-            <w:shd w:fill="E2EFDA"/>
+            <w:tcW w:type="dxa" w:w="1872"/>
+            <w:vAlign w:val="center"/>
+            <w:tcBorders>
+              <w:top w:val="single" w:sz="4" w:space="0" w:color="CBD5E1"/>
+              <w:left w:val="single" w:sz="4" w:space="0" w:color="CBD5E1"/>
+              <w:bottom w:val="single" w:sz="4" w:space="0" w:color="CBD5E1"/>
+              <w:right w:val="single" w:sz="4" w:space="0" w:color="CBD5E1"/>
+            </w:tcBorders>
+            <w:shd w:fill="E0F2FE"/>
           </w:tcPr>
           <w:p>
             <w:pPr>
@@ -898,30 +1259,25 @@
               <w:rPr>
                 <w:rFonts w:ascii="Times New Roman" w:hAnsi="Times New Roman"/>
                 <w:b/>
-                <w:sz w:val="24"/>
+                <w:i w:val="0"/>
+                <w:color w:val="0369A1"/>
+                <w:sz w:val="21"/>
               </w:rPr>
-              <w:t>Robotics - 8A1</w:t>
+              <w:t>Tin - 6A1</w:t>
             </w:r>
           </w:p>
         </w:tc>
         <w:tc>
           <w:tcPr>
-            <w:tcW w:type="dxa" w:w="1080"/>
-          </w:tcPr>
-          <w:p/>
-        </w:tc>
-      </w:tr>
-      <w:tr>
-        <w:tc>
-          <w:tcPr>
-            <w:tcW w:type="dxa" w:w="1080"/>
-            <w:vMerge/>
-          </w:tcPr>
-          <w:p/>
-        </w:tc>
-        <w:tc>
-          <w:tcPr>
-            <w:tcW w:type="dxa" w:w="1080"/>
+            <w:tcW w:type="dxa" w:w="1296"/>
+            <w:vAlign w:val="center"/>
+            <w:tcBorders>
+              <w:top w:val="single" w:sz="4" w:space="0" w:color="CBD5E1"/>
+              <w:left w:val="single" w:sz="4" w:space="0" w:color="CBD5E1"/>
+              <w:bottom w:val="single" w:sz="4" w:space="0" w:color="CBD5E1"/>
+              <w:right w:val="single" w:sz="4" w:space="0" w:color="CBD5E1"/>
+            </w:tcBorders>
+            <w:shd w:fill="FFFFFF"/>
           </w:tcPr>
           <w:p>
             <w:pPr>
@@ -930,21 +1286,42 @@
             <w:r>
               <w:rPr>
                 <w:rFonts w:ascii="Times New Roman" w:hAnsi="Times New Roman"/>
+                <w:b w:val="0"/>
+                <w:i w:val="0"/>
+                <w:color w:val="94A3B8"/>
+                <w:sz w:val="19"/>
               </w:rPr>
-              <w:t>Tiết 3</w:t>
             </w:r>
           </w:p>
         </w:tc>
+      </w:tr>
+      <w:tr>
         <w:tc>
           <w:tcPr>
-            <w:tcW w:type="dxa" w:w="1080"/>
+            <w:tcW w:type="dxa" w:w="1296"/>
+            <w:vAlign w:val="center"/>
+            <w:vMerge/>
+            <w:tcBorders>
+              <w:top w:val="single" w:sz="4" w:space="0" w:color="CBD5E1"/>
+              <w:left w:val="single" w:sz="4" w:space="0" w:color="CBD5E1"/>
+              <w:bottom w:val="single" w:sz="4" w:space="0" w:color="CBD5E1"/>
+              <w:right w:val="single" w:sz="4" w:space="0" w:color="CBD5E1"/>
+            </w:tcBorders>
+            <w:shd w:fill="F1F5F9"/>
           </w:tcPr>
           <w:p/>
         </w:tc>
         <w:tc>
           <w:tcPr>
-            <w:tcW w:type="dxa" w:w="1080"/>
-            <w:shd w:fill="D9E1F2"/>
+            <w:tcW w:type="dxa" w:w="1152"/>
+            <w:vAlign w:val="center"/>
+            <w:tcBorders>
+              <w:top w:val="single" w:sz="4" w:space="0" w:color="CBD5E1"/>
+              <w:left w:val="single" w:sz="4" w:space="0" w:color="CBD5E1"/>
+              <w:bottom w:val="single" w:sz="4" w:space="0" w:color="CBD5E1"/>
+              <w:right w:val="single" w:sz="4" w:space="0" w:color="CBD5E1"/>
+            </w:tcBorders>
+            <w:shd w:fill="FAFAFA"/>
           </w:tcPr>
           <w:p>
             <w:pPr>
@@ -954,16 +1331,25 @@
               <w:rPr>
                 <w:rFonts w:ascii="Times New Roman" w:hAnsi="Times New Roman"/>
                 <w:b/>
-                <w:sz w:val="24"/>
+                <w:i w:val="0"/>
+                <w:color w:val="0F172A"/>
+                <w:sz w:val="20"/>
               </w:rPr>
-              <w:t>Tin - 7A1</w:t>
+              <w:t>Tiết 5</w:t>
             </w:r>
           </w:p>
         </w:tc>
         <w:tc>
           <w:tcPr>
-            <w:tcW w:type="dxa" w:w="1080"/>
-            <w:shd w:fill="D9E1F2"/>
+            <w:tcW w:type="dxa" w:w="2016"/>
+            <w:vAlign w:val="center"/>
+            <w:tcBorders>
+              <w:top w:val="single" w:sz="4" w:space="0" w:color="CBD5E1"/>
+              <w:left w:val="single" w:sz="4" w:space="0" w:color="CBD5E1"/>
+              <w:bottom w:val="single" w:sz="4" w:space="0" w:color="CBD5E1"/>
+              <w:right w:val="single" w:sz="4" w:space="0" w:color="CBD5E1"/>
+            </w:tcBorders>
+            <w:shd w:fill="F8FAFC"/>
           </w:tcPr>
           <w:p>
             <w:pPr>
@@ -973,16 +1359,135 @@
               <w:rPr>
                 <w:rFonts w:ascii="Times New Roman" w:hAnsi="Times New Roman"/>
                 <w:b/>
-                <w:sz w:val="24"/>
+                <w:i w:val="0"/>
+                <w:color w:val="334155"/>
+                <w:sz w:val="18"/>
               </w:rPr>
-              <w:t>Tin - 4C1</w:t>
+              <w:t>11:15 - 11:50</w:t>
+              <w:br/>
+              <w:t>(THCS)</w:t>
             </w:r>
           </w:p>
         </w:tc>
         <w:tc>
           <w:tcPr>
-            <w:tcW w:type="dxa" w:w="1080"/>
-            <w:shd w:fill="D9E1F2"/>
+            <w:tcW w:type="dxa" w:w="1872"/>
+            <w:vAlign w:val="center"/>
+            <w:tcBorders>
+              <w:top w:val="single" w:sz="4" w:space="0" w:color="CBD5E1"/>
+              <w:left w:val="single" w:sz="4" w:space="0" w:color="CBD5E1"/>
+              <w:bottom w:val="single" w:sz="4" w:space="0" w:color="CBD5E1"/>
+              <w:right w:val="single" w:sz="4" w:space="0" w:color="CBD5E1"/>
+            </w:tcBorders>
+            <w:shd w:fill="FFFFFF"/>
+          </w:tcPr>
+          <w:p>
+            <w:pPr>
+              <w:jc w:val="center"/>
+            </w:pPr>
+            <w:r>
+              <w:rPr>
+                <w:rFonts w:ascii="Times New Roman" w:hAnsi="Times New Roman"/>
+                <w:b w:val="0"/>
+                <w:i w:val="0"/>
+                <w:color w:val="94A3B8"/>
+                <w:sz w:val="19"/>
+              </w:rPr>
+            </w:r>
+          </w:p>
+        </w:tc>
+        <w:tc>
+          <w:tcPr>
+            <w:tcW w:type="dxa" w:w="1872"/>
+            <w:vAlign w:val="center"/>
+            <w:tcBorders>
+              <w:top w:val="single" w:sz="4" w:space="0" w:color="CBD5E1"/>
+              <w:left w:val="single" w:sz="4" w:space="0" w:color="CBD5E1"/>
+              <w:bottom w:val="single" w:sz="4" w:space="0" w:color="CBD5E1"/>
+              <w:right w:val="single" w:sz="4" w:space="0" w:color="CBD5E1"/>
+            </w:tcBorders>
+            <w:shd w:fill="FFFFFF"/>
+          </w:tcPr>
+          <w:p>
+            <w:pPr>
+              <w:jc w:val="center"/>
+            </w:pPr>
+            <w:r>
+              <w:rPr>
+                <w:rFonts w:ascii="Times New Roman" w:hAnsi="Times New Roman"/>
+                <w:b w:val="0"/>
+                <w:i w:val="0"/>
+                <w:color w:val="94A3B8"/>
+                <w:sz w:val="19"/>
+              </w:rPr>
+            </w:r>
+          </w:p>
+        </w:tc>
+        <w:tc>
+          <w:tcPr>
+            <w:tcW w:type="dxa" w:w="1872"/>
+            <w:vAlign w:val="center"/>
+            <w:tcBorders>
+              <w:top w:val="single" w:sz="4" w:space="0" w:color="CBD5E1"/>
+              <w:left w:val="single" w:sz="4" w:space="0" w:color="CBD5E1"/>
+              <w:bottom w:val="single" w:sz="4" w:space="0" w:color="CBD5E1"/>
+              <w:right w:val="single" w:sz="4" w:space="0" w:color="CBD5E1"/>
+            </w:tcBorders>
+            <w:shd w:fill="FFFFFF"/>
+          </w:tcPr>
+          <w:p>
+            <w:pPr>
+              <w:jc w:val="center"/>
+            </w:pPr>
+            <w:r>
+              <w:rPr>
+                <w:rFonts w:ascii="Times New Roman" w:hAnsi="Times New Roman"/>
+                <w:b w:val="0"/>
+                <w:i w:val="0"/>
+                <w:color w:val="94A3B8"/>
+                <w:sz w:val="19"/>
+              </w:rPr>
+            </w:r>
+          </w:p>
+        </w:tc>
+        <w:tc>
+          <w:tcPr>
+            <w:tcW w:type="dxa" w:w="1872"/>
+            <w:vAlign w:val="center"/>
+            <w:tcBorders>
+              <w:top w:val="single" w:sz="4" w:space="0" w:color="CBD5E1"/>
+              <w:left w:val="single" w:sz="4" w:space="0" w:color="CBD5E1"/>
+              <w:bottom w:val="single" w:sz="4" w:space="0" w:color="CBD5E1"/>
+              <w:right w:val="single" w:sz="4" w:space="0" w:color="CBD5E1"/>
+            </w:tcBorders>
+            <w:shd w:fill="FFFFFF"/>
+          </w:tcPr>
+          <w:p>
+            <w:pPr>
+              <w:jc w:val="center"/>
+            </w:pPr>
+            <w:r>
+              <w:rPr>
+                <w:rFonts w:ascii="Times New Roman" w:hAnsi="Times New Roman"/>
+                <w:b w:val="0"/>
+                <w:i w:val="0"/>
+                <w:color w:val="94A3B8"/>
+                <w:sz w:val="19"/>
+              </w:rPr>
+            </w:r>
+          </w:p>
+        </w:tc>
+        <w:tc>
+          <w:tcPr>
+            <w:tcW w:type="dxa" w:w="1872"/>
+            <w:vAlign w:val="center"/>
+            <w:tcBorders>
+              <w:top w:val="single" w:sz="4" w:space="0" w:color="CBD5E1"/>
+              <w:left w:val="single" w:sz="4" w:space="0" w:color="CBD5E1"/>
+              <w:bottom w:val="single" w:sz="4" w:space="0" w:color="CBD5E1"/>
+              <w:right w:val="single" w:sz="4" w:space="0" w:color="CBD5E1"/>
+            </w:tcBorders>
+            <w:shd w:fill="FEF3C7"/>
           </w:tcPr>
           <w:p>
             <w:pPr>
@@ -992,16 +1497,55 @@
               <w:rPr>
                 <w:rFonts w:ascii="Times New Roman" w:hAnsi="Times New Roman"/>
                 <w:b/>
-                <w:sz w:val="24"/>
+                <w:i w:val="0"/>
+                <w:color w:val="B45309"/>
+                <w:sz w:val="21"/>
               </w:rPr>
-              <w:t>Tin - TTH2</w:t>
+              <w:t>Robotics - 6A1</w:t>
             </w:r>
           </w:p>
         </w:tc>
         <w:tc>
           <w:tcPr>
-            <w:tcW w:type="dxa" w:w="1080"/>
-            <w:shd w:fill="E2EFDA"/>
+            <w:tcW w:type="dxa" w:w="1296"/>
+            <w:vAlign w:val="center"/>
+            <w:tcBorders>
+              <w:top w:val="single" w:sz="4" w:space="0" w:color="CBD5E1"/>
+              <w:left w:val="single" w:sz="4" w:space="0" w:color="CBD5E1"/>
+              <w:bottom w:val="single" w:sz="4" w:space="0" w:color="CBD5E1"/>
+              <w:right w:val="single" w:sz="4" w:space="0" w:color="CBD5E1"/>
+            </w:tcBorders>
+            <w:shd w:fill="FFFFFF"/>
+          </w:tcPr>
+          <w:p>
+            <w:pPr>
+              <w:jc w:val="center"/>
+            </w:pPr>
+            <w:r>
+              <w:rPr>
+                <w:rFonts w:ascii="Times New Roman" w:hAnsi="Times New Roman"/>
+                <w:b w:val="0"/>
+                <w:i w:val="0"/>
+                <w:color w:val="94A3B8"/>
+                <w:sz w:val="19"/>
+              </w:rPr>
+            </w:r>
+          </w:p>
+        </w:tc>
+      </w:tr>
+      <w:tr>
+        <w:tc>
+          <w:tcPr>
+            <w:tcW w:type="dxa" w:w="1296"/>
+            <w:vAlign w:val="center"/>
+            <w:vMerge w:val="restart"/>
+            <w:tcBorders>
+              <w:top w:val="single" w:sz="4" w:space="0" w:color="CBD5E1"/>
+              <w:left w:val="single" w:sz="4" w:space="0" w:color="CBD5E1"/>
+              <w:bottom w:val="single" w:sz="4" w:space="0" w:color="CBD5E1"/>
+              <w:right w:val="single" w:sz="4" w:space="0" w:color="CBD5E1"/>
+            </w:tcBorders>
+            <w:shd w:fill="E2E8F0"/>
           </w:tcPr>
           <w:p>
             <w:pPr>
@@ -1011,53 +1555,25 @@
               <w:rPr>
                 <w:rFonts w:ascii="Times New Roman" w:hAnsi="Times New Roman"/>
                 <w:b/>
-                <w:sz w:val="24"/>
+                <w:i w:val="0"/>
+                <w:color w:val="1D2A64"/>
+                <w:sz w:val="22"/>
               </w:rPr>
-              <w:t>Robotics - 4C1</w:t>
+              <w:t>CHIỀU</w:t>
             </w:r>
           </w:p>
         </w:tc>
         <w:tc>
           <w:tcPr>
-            <w:tcW w:type="dxa" w:w="1080"/>
-          </w:tcPr>
-          <w:p/>
-        </w:tc>
-      </w:tr>
-      <w:tr>
-        <w:tc>
-          <w:tcPr>
-            <w:tcW w:type="dxa" w:w="1080"/>
-            <w:vMerge/>
-          </w:tcPr>
-          <w:p/>
-        </w:tc>
-        <w:tc>
-          <w:tcPr>
-            <w:tcW w:type="dxa" w:w="1080"/>
-          </w:tcPr>
-          <w:p>
-            <w:pPr>
-              <w:jc w:val="center"/>
-            </w:pPr>
-            <w:r>
-              <w:rPr>
-                <w:rFonts w:ascii="Times New Roman" w:hAnsi="Times New Roman"/>
-              </w:rPr>
-              <w:t>Tiết 4</w:t>
-            </w:r>
-          </w:p>
-        </w:tc>
-        <w:tc>
-          <w:tcPr>
-            <w:tcW w:type="dxa" w:w="1080"/>
-          </w:tcPr>
-          <w:p/>
-        </w:tc>
-        <w:tc>
-          <w:tcPr>
-            <w:tcW w:type="dxa" w:w="1080"/>
-            <w:shd w:fill="E2EFDA"/>
+            <w:tcW w:type="dxa" w:w="1152"/>
+            <w:vAlign w:val="center"/>
+            <w:tcBorders>
+              <w:top w:val="single" w:sz="4" w:space="0" w:color="CBD5E1"/>
+              <w:left w:val="single" w:sz="4" w:space="0" w:color="CBD5E1"/>
+              <w:bottom w:val="single" w:sz="4" w:space="0" w:color="CBD5E1"/>
+              <w:right w:val="single" w:sz="4" w:space="0" w:color="CBD5E1"/>
+            </w:tcBorders>
+            <w:shd w:fill="FAFAFA"/>
           </w:tcPr>
           <w:p>
             <w:pPr>
@@ -1067,16 +1583,25 @@
               <w:rPr>
                 <w:rFonts w:ascii="Times New Roman" w:hAnsi="Times New Roman"/>
                 <w:b/>
-                <w:sz w:val="24"/>
+                <w:i w:val="0"/>
+                <w:color w:val="0F172A"/>
+                <w:sz w:val="20"/>
               </w:rPr>
-              <w:t>Robotics - 7A1</w:t>
+              <w:t>Tiết 1</w:t>
             </w:r>
           </w:p>
         </w:tc>
         <w:tc>
           <w:tcPr>
-            <w:tcW w:type="dxa" w:w="1080"/>
-            <w:shd w:fill="E2EFDA"/>
+            <w:tcW w:type="dxa" w:w="2016"/>
+            <w:vAlign w:val="center"/>
+            <w:tcBorders>
+              <w:top w:val="single" w:sz="4" w:space="0" w:color="CBD5E1"/>
+              <w:left w:val="single" w:sz="4" w:space="0" w:color="CBD5E1"/>
+              <w:bottom w:val="single" w:sz="4" w:space="0" w:color="CBD5E1"/>
+              <w:right w:val="single" w:sz="4" w:space="0" w:color="CBD5E1"/>
+            </w:tcBorders>
+            <w:shd w:fill="F8FAFC"/>
           </w:tcPr>
           <w:p>
             <w:pPr>
@@ -1086,16 +1611,54 @@
               <w:rPr>
                 <w:rFonts w:ascii="Times New Roman" w:hAnsi="Times New Roman"/>
                 <w:b/>
-                <w:sz w:val="24"/>
+                <w:i w:val="0"/>
+                <w:color w:val="334155"/>
+                <w:sz w:val="18"/>
               </w:rPr>
-              <w:t>Robotics - 2A1</w:t>
+              <w:t>13:15 - 13:50</w:t>
+              <w:br/>
+              <w:t>(13:05-13:50)</w:t>
             </w:r>
           </w:p>
         </w:tc>
         <w:tc>
           <w:tcPr>
-            <w:tcW w:type="dxa" w:w="1080"/>
-            <w:shd w:fill="E2EFDA"/>
+            <w:tcW w:type="dxa" w:w="1872"/>
+            <w:vAlign w:val="center"/>
+            <w:tcBorders>
+              <w:top w:val="single" w:sz="4" w:space="0" w:color="CBD5E1"/>
+              <w:left w:val="single" w:sz="4" w:space="0" w:color="CBD5E1"/>
+              <w:bottom w:val="single" w:sz="4" w:space="0" w:color="CBD5E1"/>
+              <w:right w:val="single" w:sz="4" w:space="0" w:color="CBD5E1"/>
+            </w:tcBorders>
+            <w:shd w:fill="FFFFFF"/>
+          </w:tcPr>
+          <w:p>
+            <w:pPr>
+              <w:jc w:val="center"/>
+            </w:pPr>
+            <w:r>
+              <w:rPr>
+                <w:rFonts w:ascii="Times New Roman" w:hAnsi="Times New Roman"/>
+                <w:b w:val="0"/>
+                <w:i w:val="0"/>
+                <w:color w:val="94A3B8"/>
+                <w:sz w:val="19"/>
+              </w:rPr>
+            </w:r>
+          </w:p>
+        </w:tc>
+        <w:tc>
+          <w:tcPr>
+            <w:tcW w:type="dxa" w:w="1872"/>
+            <w:vAlign w:val="center"/>
+            <w:tcBorders>
+              <w:top w:val="single" w:sz="4" w:space="0" w:color="CBD5E1"/>
+              <w:left w:val="single" w:sz="4" w:space="0" w:color="CBD5E1"/>
+              <w:bottom w:val="single" w:sz="4" w:space="0" w:color="CBD5E1"/>
+              <w:right w:val="single" w:sz="4" w:space="0" w:color="CBD5E1"/>
+            </w:tcBorders>
+            <w:shd w:fill="E0F2FE"/>
           </w:tcPr>
           <w:p>
             <w:pPr>
@@ -1105,36 +1668,25 @@
               <w:rPr>
                 <w:rFonts w:ascii="Times New Roman" w:hAnsi="Times New Roman"/>
                 <w:b/>
-                <w:sz w:val="24"/>
+                <w:i w:val="0"/>
+                <w:color w:val="0369A1"/>
+                <w:sz w:val="21"/>
               </w:rPr>
-              <w:t>Robotics - 1C1</w:t>
+              <w:t>Tin - 2A1</w:t>
             </w:r>
           </w:p>
         </w:tc>
         <w:tc>
           <w:tcPr>
-            <w:tcW w:type="dxa" w:w="1080"/>
-          </w:tcPr>
-          <w:p/>
-        </w:tc>
-        <w:tc>
-          <w:tcPr>
-            <w:tcW w:type="dxa" w:w="1080"/>
-          </w:tcPr>
-          <w:p/>
-        </w:tc>
-      </w:tr>
-      <w:tr>
-        <w:tc>
-          <w:tcPr>
-            <w:tcW w:type="dxa" w:w="1080"/>
-            <w:vMerge/>
-          </w:tcPr>
-          <w:p/>
-        </w:tc>
-        <w:tc>
-          <w:tcPr>
-            <w:tcW w:type="dxa" w:w="1080"/>
+            <w:tcW w:type="dxa" w:w="1872"/>
+            <w:vAlign w:val="center"/>
+            <w:tcBorders>
+              <w:top w:val="single" w:sz="4" w:space="0" w:color="CBD5E1"/>
+              <w:left w:val="single" w:sz="4" w:space="0" w:color="CBD5E1"/>
+              <w:bottom w:val="single" w:sz="4" w:space="0" w:color="CBD5E1"/>
+              <w:right w:val="single" w:sz="4" w:space="0" w:color="CBD5E1"/>
+            </w:tcBorders>
+            <w:shd w:fill="FFFFFF"/>
           </w:tcPr>
           <w:p>
             <w:pPr>
@@ -1143,6 +1695,858 @@
             <w:r>
               <w:rPr>
                 <w:rFonts w:ascii="Times New Roman" w:hAnsi="Times New Roman"/>
+                <w:b w:val="0"/>
+                <w:i w:val="0"/>
+                <w:color w:val="94A3B8"/>
+                <w:sz w:val="19"/>
+              </w:rPr>
+            </w:r>
+          </w:p>
+        </w:tc>
+        <w:tc>
+          <w:tcPr>
+            <w:tcW w:type="dxa" w:w="1872"/>
+            <w:vAlign w:val="center"/>
+            <w:tcBorders>
+              <w:top w:val="single" w:sz="4" w:space="0" w:color="CBD5E1"/>
+              <w:left w:val="single" w:sz="4" w:space="0" w:color="CBD5E1"/>
+              <w:bottom w:val="single" w:sz="4" w:space="0" w:color="CBD5E1"/>
+              <w:right w:val="single" w:sz="4" w:space="0" w:color="CBD5E1"/>
+            </w:tcBorders>
+            <w:shd w:fill="E0F2FE"/>
+          </w:tcPr>
+          <w:p>
+            <w:pPr>
+              <w:jc w:val="center"/>
+            </w:pPr>
+            <w:r>
+              <w:rPr>
+                <w:rFonts w:ascii="Times New Roman" w:hAnsi="Times New Roman"/>
+                <w:b/>
+                <w:i w:val="0"/>
+                <w:color w:val="0369A1"/>
+                <w:sz w:val="21"/>
+              </w:rPr>
+              <w:t>Tin - 3A1</w:t>
+            </w:r>
+          </w:p>
+        </w:tc>
+        <w:tc>
+          <w:tcPr>
+            <w:tcW w:type="dxa" w:w="1872"/>
+            <w:vAlign w:val="center"/>
+            <w:tcBorders>
+              <w:top w:val="single" w:sz="4" w:space="0" w:color="CBD5E1"/>
+              <w:left w:val="single" w:sz="4" w:space="0" w:color="CBD5E1"/>
+              <w:bottom w:val="single" w:sz="4" w:space="0" w:color="CBD5E1"/>
+              <w:right w:val="single" w:sz="4" w:space="0" w:color="CBD5E1"/>
+            </w:tcBorders>
+            <w:shd w:fill="E0F2FE"/>
+          </w:tcPr>
+          <w:p>
+            <w:pPr>
+              <w:jc w:val="center"/>
+            </w:pPr>
+            <w:r>
+              <w:rPr>
+                <w:rFonts w:ascii="Times New Roman" w:hAnsi="Times New Roman"/>
+                <w:b/>
+                <w:i w:val="0"/>
+                <w:color w:val="0369A1"/>
+                <w:sz w:val="21"/>
+              </w:rPr>
+              <w:t>Tin - 8A1</w:t>
+            </w:r>
+          </w:p>
+        </w:tc>
+        <w:tc>
+          <w:tcPr>
+            <w:tcW w:type="dxa" w:w="1296"/>
+            <w:vAlign w:val="center"/>
+            <w:tcBorders>
+              <w:top w:val="single" w:sz="4" w:space="0" w:color="CBD5E1"/>
+              <w:left w:val="single" w:sz="4" w:space="0" w:color="CBD5E1"/>
+              <w:bottom w:val="single" w:sz="4" w:space="0" w:color="CBD5E1"/>
+              <w:right w:val="single" w:sz="4" w:space="0" w:color="CBD5E1"/>
+            </w:tcBorders>
+            <w:shd w:fill="FFFFFF"/>
+          </w:tcPr>
+          <w:p>
+            <w:pPr>
+              <w:jc w:val="center"/>
+            </w:pPr>
+            <w:r>
+              <w:rPr>
+                <w:rFonts w:ascii="Times New Roman" w:hAnsi="Times New Roman"/>
+                <w:b w:val="0"/>
+                <w:i w:val="0"/>
+                <w:color w:val="94A3B8"/>
+                <w:sz w:val="19"/>
+              </w:rPr>
+            </w:r>
+          </w:p>
+        </w:tc>
+      </w:tr>
+      <w:tr>
+        <w:tc>
+          <w:tcPr>
+            <w:tcW w:type="dxa" w:w="1296"/>
+            <w:vAlign w:val="center"/>
+            <w:vMerge/>
+            <w:tcBorders>
+              <w:top w:val="single" w:sz="4" w:space="0" w:color="CBD5E1"/>
+              <w:left w:val="single" w:sz="4" w:space="0" w:color="CBD5E1"/>
+              <w:bottom w:val="single" w:sz="4" w:space="0" w:color="CBD5E1"/>
+              <w:right w:val="single" w:sz="4" w:space="0" w:color="CBD5E1"/>
+            </w:tcBorders>
+            <w:shd w:fill="E2E8F0"/>
+          </w:tcPr>
+          <w:p/>
+        </w:tc>
+        <w:tc>
+          <w:tcPr>
+            <w:tcW w:type="dxa" w:w="1152"/>
+            <w:vAlign w:val="center"/>
+            <w:tcBorders>
+              <w:top w:val="single" w:sz="4" w:space="0" w:color="CBD5E1"/>
+              <w:left w:val="single" w:sz="4" w:space="0" w:color="CBD5E1"/>
+              <w:bottom w:val="single" w:sz="4" w:space="0" w:color="CBD5E1"/>
+              <w:right w:val="single" w:sz="4" w:space="0" w:color="CBD5E1"/>
+            </w:tcBorders>
+            <w:shd w:fill="FAFAFA"/>
+          </w:tcPr>
+          <w:p>
+            <w:pPr>
+              <w:jc w:val="center"/>
+            </w:pPr>
+            <w:r>
+              <w:rPr>
+                <w:rFonts w:ascii="Times New Roman" w:hAnsi="Times New Roman"/>
+                <w:b/>
+                <w:i w:val="0"/>
+                <w:color w:val="0F172A"/>
+                <w:sz w:val="20"/>
+              </w:rPr>
+              <w:t>Tiết 2</w:t>
+            </w:r>
+          </w:p>
+        </w:tc>
+        <w:tc>
+          <w:tcPr>
+            <w:tcW w:type="dxa" w:w="2016"/>
+            <w:vAlign w:val="center"/>
+            <w:tcBorders>
+              <w:top w:val="single" w:sz="4" w:space="0" w:color="CBD5E1"/>
+              <w:left w:val="single" w:sz="4" w:space="0" w:color="CBD5E1"/>
+              <w:bottom w:val="single" w:sz="4" w:space="0" w:color="CBD5E1"/>
+              <w:right w:val="single" w:sz="4" w:space="0" w:color="CBD5E1"/>
+            </w:tcBorders>
+            <w:shd w:fill="F8FAFC"/>
+          </w:tcPr>
+          <w:p>
+            <w:pPr>
+              <w:jc w:val="center"/>
+            </w:pPr>
+            <w:r>
+              <w:rPr>
+                <w:rFonts w:ascii="Times New Roman" w:hAnsi="Times New Roman"/>
+                <w:b/>
+                <w:i w:val="0"/>
+                <w:color w:val="334155"/>
+                <w:sz w:val="18"/>
+              </w:rPr>
+              <w:t>13:55 - 14:30</w:t>
+              <w:br/>
+              <w:t>(13:55-14:40)</w:t>
+            </w:r>
+          </w:p>
+        </w:tc>
+        <w:tc>
+          <w:tcPr>
+            <w:tcW w:type="dxa" w:w="1872"/>
+            <w:vAlign w:val="center"/>
+            <w:tcBorders>
+              <w:top w:val="single" w:sz="4" w:space="0" w:color="CBD5E1"/>
+              <w:left w:val="single" w:sz="4" w:space="0" w:color="CBD5E1"/>
+              <w:bottom w:val="single" w:sz="4" w:space="0" w:color="CBD5E1"/>
+              <w:right w:val="single" w:sz="4" w:space="0" w:color="CBD5E1"/>
+            </w:tcBorders>
+            <w:shd w:fill="FFFFFF"/>
+          </w:tcPr>
+          <w:p>
+            <w:pPr>
+              <w:jc w:val="center"/>
+            </w:pPr>
+            <w:r>
+              <w:rPr>
+                <w:rFonts w:ascii="Times New Roman" w:hAnsi="Times New Roman"/>
+                <w:b w:val="0"/>
+                <w:i w:val="0"/>
+                <w:color w:val="94A3B8"/>
+                <w:sz w:val="19"/>
+              </w:rPr>
+            </w:r>
+          </w:p>
+        </w:tc>
+        <w:tc>
+          <w:tcPr>
+            <w:tcW w:type="dxa" w:w="1872"/>
+            <w:vAlign w:val="center"/>
+            <w:tcBorders>
+              <w:top w:val="single" w:sz="4" w:space="0" w:color="CBD5E1"/>
+              <w:left w:val="single" w:sz="4" w:space="0" w:color="CBD5E1"/>
+              <w:bottom w:val="single" w:sz="4" w:space="0" w:color="CBD5E1"/>
+              <w:right w:val="single" w:sz="4" w:space="0" w:color="CBD5E1"/>
+            </w:tcBorders>
+            <w:shd w:fill="E0F2FE"/>
+          </w:tcPr>
+          <w:p>
+            <w:pPr>
+              <w:jc w:val="center"/>
+            </w:pPr>
+            <w:r>
+              <w:rPr>
+                <w:rFonts w:ascii="Times New Roman" w:hAnsi="Times New Roman"/>
+                <w:b/>
+                <w:i w:val="0"/>
+                <w:color w:val="0369A1"/>
+                <w:sz w:val="21"/>
+              </w:rPr>
+              <w:t>Tin - 1C1</w:t>
+            </w:r>
+          </w:p>
+        </w:tc>
+        <w:tc>
+          <w:tcPr>
+            <w:tcW w:type="dxa" w:w="1872"/>
+            <w:vAlign w:val="center"/>
+            <w:tcBorders>
+              <w:top w:val="single" w:sz="4" w:space="0" w:color="CBD5E1"/>
+              <w:left w:val="single" w:sz="4" w:space="0" w:color="CBD5E1"/>
+              <w:bottom w:val="single" w:sz="4" w:space="0" w:color="CBD5E1"/>
+              <w:right w:val="single" w:sz="4" w:space="0" w:color="CBD5E1"/>
+            </w:tcBorders>
+            <w:shd w:fill="FFFFFF"/>
+          </w:tcPr>
+          <w:p>
+            <w:pPr>
+              <w:jc w:val="center"/>
+            </w:pPr>
+            <w:r>
+              <w:rPr>
+                <w:rFonts w:ascii="Times New Roman" w:hAnsi="Times New Roman"/>
+                <w:b w:val="0"/>
+                <w:i w:val="0"/>
+                <w:color w:val="94A3B8"/>
+                <w:sz w:val="19"/>
+              </w:rPr>
+            </w:r>
+          </w:p>
+        </w:tc>
+        <w:tc>
+          <w:tcPr>
+            <w:tcW w:type="dxa" w:w="1872"/>
+            <w:vAlign w:val="center"/>
+            <w:tcBorders>
+              <w:top w:val="single" w:sz="4" w:space="0" w:color="CBD5E1"/>
+              <w:left w:val="single" w:sz="4" w:space="0" w:color="CBD5E1"/>
+              <w:bottom w:val="single" w:sz="4" w:space="0" w:color="CBD5E1"/>
+              <w:right w:val="single" w:sz="4" w:space="0" w:color="CBD5E1"/>
+            </w:tcBorders>
+            <w:shd w:fill="E0F2FE"/>
+          </w:tcPr>
+          <w:p>
+            <w:pPr>
+              <w:jc w:val="center"/>
+            </w:pPr>
+            <w:r>
+              <w:rPr>
+                <w:rFonts w:ascii="Times New Roman" w:hAnsi="Times New Roman"/>
+                <w:b/>
+                <w:i w:val="0"/>
+                <w:color w:val="0369A1"/>
+                <w:sz w:val="21"/>
+              </w:rPr>
+              <w:t>Tin - TTH 1</w:t>
+            </w:r>
+          </w:p>
+        </w:tc>
+        <w:tc>
+          <w:tcPr>
+            <w:tcW w:type="dxa" w:w="1872"/>
+            <w:vAlign w:val="center"/>
+            <w:tcBorders>
+              <w:top w:val="single" w:sz="4" w:space="0" w:color="CBD5E1"/>
+              <w:left w:val="single" w:sz="4" w:space="0" w:color="CBD5E1"/>
+              <w:bottom w:val="single" w:sz="4" w:space="0" w:color="CBD5E1"/>
+              <w:right w:val="single" w:sz="4" w:space="0" w:color="CBD5E1"/>
+            </w:tcBorders>
+            <w:shd w:fill="FEF3C7"/>
+          </w:tcPr>
+          <w:p>
+            <w:pPr>
+              <w:jc w:val="center"/>
+            </w:pPr>
+            <w:r>
+              <w:rPr>
+                <w:rFonts w:ascii="Times New Roman" w:hAnsi="Times New Roman"/>
+                <w:b/>
+                <w:i w:val="0"/>
+                <w:color w:val="B45309"/>
+                <w:sz w:val="21"/>
+              </w:rPr>
+              <w:t>Robotics - 8A1</w:t>
+            </w:r>
+          </w:p>
+        </w:tc>
+        <w:tc>
+          <w:tcPr>
+            <w:tcW w:type="dxa" w:w="1296"/>
+            <w:vAlign w:val="center"/>
+            <w:tcBorders>
+              <w:top w:val="single" w:sz="4" w:space="0" w:color="CBD5E1"/>
+              <w:left w:val="single" w:sz="4" w:space="0" w:color="CBD5E1"/>
+              <w:bottom w:val="single" w:sz="4" w:space="0" w:color="CBD5E1"/>
+              <w:right w:val="single" w:sz="4" w:space="0" w:color="CBD5E1"/>
+            </w:tcBorders>
+            <w:shd w:fill="FFFFFF"/>
+          </w:tcPr>
+          <w:p>
+            <w:pPr>
+              <w:jc w:val="center"/>
+            </w:pPr>
+            <w:r>
+              <w:rPr>
+                <w:rFonts w:ascii="Times New Roman" w:hAnsi="Times New Roman"/>
+                <w:b w:val="0"/>
+                <w:i w:val="0"/>
+                <w:color w:val="94A3B8"/>
+                <w:sz w:val="19"/>
+              </w:rPr>
+            </w:r>
+          </w:p>
+        </w:tc>
+      </w:tr>
+      <w:tr>
+        <w:tc>
+          <w:tcPr>
+            <w:tcW w:type="dxa" w:w="1296"/>
+            <w:vAlign w:val="center"/>
+            <w:vMerge/>
+            <w:tcBorders>
+              <w:top w:val="single" w:sz="4" w:space="0" w:color="CBD5E1"/>
+              <w:left w:val="single" w:sz="4" w:space="0" w:color="CBD5E1"/>
+              <w:bottom w:val="single" w:sz="4" w:space="0" w:color="CBD5E1"/>
+              <w:right w:val="single" w:sz="4" w:space="0" w:color="CBD5E1"/>
+            </w:tcBorders>
+            <w:shd w:fill="E2E8F0"/>
+          </w:tcPr>
+          <w:p/>
+        </w:tc>
+        <w:tc>
+          <w:tcPr>
+            <w:tcW w:type="dxa" w:w="1152"/>
+            <w:vAlign w:val="center"/>
+            <w:tcBorders>
+              <w:top w:val="single" w:sz="4" w:space="0" w:color="CBD5E1"/>
+              <w:left w:val="single" w:sz="4" w:space="0" w:color="CBD5E1"/>
+              <w:bottom w:val="single" w:sz="4" w:space="0" w:color="CBD5E1"/>
+              <w:right w:val="single" w:sz="4" w:space="0" w:color="CBD5E1"/>
+            </w:tcBorders>
+            <w:shd w:fill="FAFAFA"/>
+          </w:tcPr>
+          <w:p>
+            <w:pPr>
+              <w:jc w:val="center"/>
+            </w:pPr>
+            <w:r>
+              <w:rPr>
+                <w:rFonts w:ascii="Times New Roman" w:hAnsi="Times New Roman"/>
+                <w:b/>
+                <w:i w:val="0"/>
+                <w:color w:val="0F172A"/>
+                <w:sz w:val="20"/>
+              </w:rPr>
+              <w:t>Tiết 3</w:t>
+            </w:r>
+          </w:p>
+        </w:tc>
+        <w:tc>
+          <w:tcPr>
+            <w:tcW w:type="dxa" w:w="2016"/>
+            <w:vAlign w:val="center"/>
+            <w:tcBorders>
+              <w:top w:val="single" w:sz="4" w:space="0" w:color="CBD5E1"/>
+              <w:left w:val="single" w:sz="4" w:space="0" w:color="CBD5E1"/>
+              <w:bottom w:val="single" w:sz="4" w:space="0" w:color="CBD5E1"/>
+              <w:right w:val="single" w:sz="4" w:space="0" w:color="CBD5E1"/>
+            </w:tcBorders>
+            <w:shd w:fill="F8FAFC"/>
+          </w:tcPr>
+          <w:p>
+            <w:pPr>
+              <w:jc w:val="center"/>
+            </w:pPr>
+            <w:r>
+              <w:rPr>
+                <w:rFonts w:ascii="Times New Roman" w:hAnsi="Times New Roman"/>
+                <w:b/>
+                <w:i w:val="0"/>
+                <w:color w:val="334155"/>
+                <w:sz w:val="18"/>
+              </w:rPr>
+              <w:t>14:55 - 15:30</w:t>
+              <w:br/>
+              <w:t>(14:50-15:30)</w:t>
+            </w:r>
+          </w:p>
+        </w:tc>
+        <w:tc>
+          <w:tcPr>
+            <w:tcW w:type="dxa" w:w="1872"/>
+            <w:vAlign w:val="center"/>
+            <w:tcBorders>
+              <w:top w:val="single" w:sz="4" w:space="0" w:color="CBD5E1"/>
+              <w:left w:val="single" w:sz="4" w:space="0" w:color="CBD5E1"/>
+              <w:bottom w:val="single" w:sz="4" w:space="0" w:color="CBD5E1"/>
+              <w:right w:val="single" w:sz="4" w:space="0" w:color="CBD5E1"/>
+            </w:tcBorders>
+            <w:shd w:fill="FFFFFF"/>
+          </w:tcPr>
+          <w:p>
+            <w:pPr>
+              <w:jc w:val="center"/>
+            </w:pPr>
+            <w:r>
+              <w:rPr>
+                <w:rFonts w:ascii="Times New Roman" w:hAnsi="Times New Roman"/>
+                <w:b w:val="0"/>
+                <w:i w:val="0"/>
+                <w:color w:val="94A3B8"/>
+                <w:sz w:val="19"/>
+              </w:rPr>
+            </w:r>
+          </w:p>
+        </w:tc>
+        <w:tc>
+          <w:tcPr>
+            <w:tcW w:type="dxa" w:w="1872"/>
+            <w:vAlign w:val="center"/>
+            <w:tcBorders>
+              <w:top w:val="single" w:sz="4" w:space="0" w:color="CBD5E1"/>
+              <w:left w:val="single" w:sz="4" w:space="0" w:color="CBD5E1"/>
+              <w:bottom w:val="single" w:sz="4" w:space="0" w:color="CBD5E1"/>
+              <w:right w:val="single" w:sz="4" w:space="0" w:color="CBD5E1"/>
+            </w:tcBorders>
+            <w:shd w:fill="E0F2FE"/>
+          </w:tcPr>
+          <w:p>
+            <w:pPr>
+              <w:jc w:val="center"/>
+            </w:pPr>
+            <w:r>
+              <w:rPr>
+                <w:rFonts w:ascii="Times New Roman" w:hAnsi="Times New Roman"/>
+                <w:b/>
+                <w:i w:val="0"/>
+                <w:color w:val="0369A1"/>
+                <w:sz w:val="21"/>
+              </w:rPr>
+              <w:t>Tin - 7A1</w:t>
+            </w:r>
+          </w:p>
+        </w:tc>
+        <w:tc>
+          <w:tcPr>
+            <w:tcW w:type="dxa" w:w="1872"/>
+            <w:vAlign w:val="center"/>
+            <w:tcBorders>
+              <w:top w:val="single" w:sz="4" w:space="0" w:color="CBD5E1"/>
+              <w:left w:val="single" w:sz="4" w:space="0" w:color="CBD5E1"/>
+              <w:bottom w:val="single" w:sz="4" w:space="0" w:color="CBD5E1"/>
+              <w:right w:val="single" w:sz="4" w:space="0" w:color="CBD5E1"/>
+            </w:tcBorders>
+            <w:shd w:fill="E0F2FE"/>
+          </w:tcPr>
+          <w:p>
+            <w:pPr>
+              <w:jc w:val="center"/>
+            </w:pPr>
+            <w:r>
+              <w:rPr>
+                <w:rFonts w:ascii="Times New Roman" w:hAnsi="Times New Roman"/>
+                <w:b/>
+                <w:i w:val="0"/>
+                <w:color w:val="0369A1"/>
+                <w:sz w:val="21"/>
+              </w:rPr>
+              <w:t>Tin - 4C1</w:t>
+            </w:r>
+          </w:p>
+        </w:tc>
+        <w:tc>
+          <w:tcPr>
+            <w:tcW w:type="dxa" w:w="1872"/>
+            <w:vAlign w:val="center"/>
+            <w:tcBorders>
+              <w:top w:val="single" w:sz="4" w:space="0" w:color="CBD5E1"/>
+              <w:left w:val="single" w:sz="4" w:space="0" w:color="CBD5E1"/>
+              <w:bottom w:val="single" w:sz="4" w:space="0" w:color="CBD5E1"/>
+              <w:right w:val="single" w:sz="4" w:space="0" w:color="CBD5E1"/>
+            </w:tcBorders>
+            <w:shd w:fill="E0F2FE"/>
+          </w:tcPr>
+          <w:p>
+            <w:pPr>
+              <w:jc w:val="center"/>
+            </w:pPr>
+            <w:r>
+              <w:rPr>
+                <w:rFonts w:ascii="Times New Roman" w:hAnsi="Times New Roman"/>
+                <w:b/>
+                <w:i w:val="0"/>
+                <w:color w:val="0369A1"/>
+                <w:sz w:val="21"/>
+              </w:rPr>
+              <w:t>Tin - TTH2</w:t>
+            </w:r>
+          </w:p>
+        </w:tc>
+        <w:tc>
+          <w:tcPr>
+            <w:tcW w:type="dxa" w:w="1872"/>
+            <w:vAlign w:val="center"/>
+            <w:tcBorders>
+              <w:top w:val="single" w:sz="4" w:space="0" w:color="CBD5E1"/>
+              <w:left w:val="single" w:sz="4" w:space="0" w:color="CBD5E1"/>
+              <w:bottom w:val="single" w:sz="4" w:space="0" w:color="CBD5E1"/>
+              <w:right w:val="single" w:sz="4" w:space="0" w:color="CBD5E1"/>
+            </w:tcBorders>
+            <w:shd w:fill="FEF3C7"/>
+          </w:tcPr>
+          <w:p>
+            <w:pPr>
+              <w:jc w:val="center"/>
+            </w:pPr>
+            <w:r>
+              <w:rPr>
+                <w:rFonts w:ascii="Times New Roman" w:hAnsi="Times New Roman"/>
+                <w:b/>
+                <w:i w:val="0"/>
+                <w:color w:val="B45309"/>
+                <w:sz w:val="21"/>
+              </w:rPr>
+              <w:t>Robotics - 4C1</w:t>
+            </w:r>
+          </w:p>
+        </w:tc>
+        <w:tc>
+          <w:tcPr>
+            <w:tcW w:type="dxa" w:w="1296"/>
+            <w:vAlign w:val="center"/>
+            <w:tcBorders>
+              <w:top w:val="single" w:sz="4" w:space="0" w:color="CBD5E1"/>
+              <w:left w:val="single" w:sz="4" w:space="0" w:color="CBD5E1"/>
+              <w:bottom w:val="single" w:sz="4" w:space="0" w:color="CBD5E1"/>
+              <w:right w:val="single" w:sz="4" w:space="0" w:color="CBD5E1"/>
+            </w:tcBorders>
+            <w:shd w:fill="FFFFFF"/>
+          </w:tcPr>
+          <w:p>
+            <w:pPr>
+              <w:jc w:val="center"/>
+            </w:pPr>
+            <w:r>
+              <w:rPr>
+                <w:rFonts w:ascii="Times New Roman" w:hAnsi="Times New Roman"/>
+                <w:b w:val="0"/>
+                <w:i w:val="0"/>
+                <w:color w:val="94A3B8"/>
+                <w:sz w:val="19"/>
+              </w:rPr>
+            </w:r>
+          </w:p>
+        </w:tc>
+      </w:tr>
+      <w:tr>
+        <w:tc>
+          <w:tcPr>
+            <w:tcW w:type="dxa" w:w="1296"/>
+            <w:vAlign w:val="center"/>
+            <w:vMerge/>
+            <w:tcBorders>
+              <w:top w:val="single" w:sz="4" w:space="0" w:color="CBD5E1"/>
+              <w:left w:val="single" w:sz="4" w:space="0" w:color="CBD5E1"/>
+              <w:bottom w:val="single" w:sz="4" w:space="0" w:color="CBD5E1"/>
+              <w:right w:val="single" w:sz="4" w:space="0" w:color="CBD5E1"/>
+            </w:tcBorders>
+            <w:shd w:fill="E2E8F0"/>
+          </w:tcPr>
+          <w:p/>
+        </w:tc>
+        <w:tc>
+          <w:tcPr>
+            <w:tcW w:type="dxa" w:w="1152"/>
+            <w:vAlign w:val="center"/>
+            <w:tcBorders>
+              <w:top w:val="single" w:sz="4" w:space="0" w:color="CBD5E1"/>
+              <w:left w:val="single" w:sz="4" w:space="0" w:color="CBD5E1"/>
+              <w:bottom w:val="single" w:sz="4" w:space="0" w:color="CBD5E1"/>
+              <w:right w:val="single" w:sz="4" w:space="0" w:color="CBD5E1"/>
+            </w:tcBorders>
+            <w:shd w:fill="FAFAFA"/>
+          </w:tcPr>
+          <w:p>
+            <w:pPr>
+              <w:jc w:val="center"/>
+            </w:pPr>
+            <w:r>
+              <w:rPr>
+                <w:rFonts w:ascii="Times New Roman" w:hAnsi="Times New Roman"/>
+                <w:b/>
+                <w:i w:val="0"/>
+                <w:color w:val="0F172A"/>
+                <w:sz w:val="20"/>
+              </w:rPr>
+              <w:t>Tiết 4</w:t>
+            </w:r>
+          </w:p>
+        </w:tc>
+        <w:tc>
+          <w:tcPr>
+            <w:tcW w:type="dxa" w:w="2016"/>
+            <w:vAlign w:val="center"/>
+            <w:tcBorders>
+              <w:top w:val="single" w:sz="4" w:space="0" w:color="CBD5E1"/>
+              <w:left w:val="single" w:sz="4" w:space="0" w:color="CBD5E1"/>
+              <w:bottom w:val="single" w:sz="4" w:space="0" w:color="CBD5E1"/>
+              <w:right w:val="single" w:sz="4" w:space="0" w:color="CBD5E1"/>
+            </w:tcBorders>
+            <w:shd w:fill="F8FAFC"/>
+          </w:tcPr>
+          <w:p>
+            <w:pPr>
+              <w:jc w:val="center"/>
+            </w:pPr>
+            <w:r>
+              <w:rPr>
+                <w:rFonts w:ascii="Times New Roman" w:hAnsi="Times New Roman"/>
+                <w:b/>
+                <w:i w:val="0"/>
+                <w:color w:val="334155"/>
+                <w:sz w:val="18"/>
+              </w:rPr>
+              <w:t>15:35 - 16:10</w:t>
+              <w:br/>
+              <w:t>(15:35-16:20)</w:t>
+            </w:r>
+          </w:p>
+        </w:tc>
+        <w:tc>
+          <w:tcPr>
+            <w:tcW w:type="dxa" w:w="1872"/>
+            <w:vAlign w:val="center"/>
+            <w:tcBorders>
+              <w:top w:val="single" w:sz="4" w:space="0" w:color="CBD5E1"/>
+              <w:left w:val="single" w:sz="4" w:space="0" w:color="CBD5E1"/>
+              <w:bottom w:val="single" w:sz="4" w:space="0" w:color="CBD5E1"/>
+              <w:right w:val="single" w:sz="4" w:space="0" w:color="CBD5E1"/>
+            </w:tcBorders>
+            <w:shd w:fill="FFFFFF"/>
+          </w:tcPr>
+          <w:p>
+            <w:pPr>
+              <w:jc w:val="center"/>
+            </w:pPr>
+            <w:r>
+              <w:rPr>
+                <w:rFonts w:ascii="Times New Roman" w:hAnsi="Times New Roman"/>
+                <w:b w:val="0"/>
+                <w:i w:val="0"/>
+                <w:color w:val="94A3B8"/>
+                <w:sz w:val="19"/>
+              </w:rPr>
+            </w:r>
+          </w:p>
+        </w:tc>
+        <w:tc>
+          <w:tcPr>
+            <w:tcW w:type="dxa" w:w="1872"/>
+            <w:vAlign w:val="center"/>
+            <w:tcBorders>
+              <w:top w:val="single" w:sz="4" w:space="0" w:color="CBD5E1"/>
+              <w:left w:val="single" w:sz="4" w:space="0" w:color="CBD5E1"/>
+              <w:bottom w:val="single" w:sz="4" w:space="0" w:color="CBD5E1"/>
+              <w:right w:val="single" w:sz="4" w:space="0" w:color="CBD5E1"/>
+            </w:tcBorders>
+            <w:shd w:fill="FEF3C7"/>
+          </w:tcPr>
+          <w:p>
+            <w:pPr>
+              <w:jc w:val="center"/>
+            </w:pPr>
+            <w:r>
+              <w:rPr>
+                <w:rFonts w:ascii="Times New Roman" w:hAnsi="Times New Roman"/>
+                <w:b/>
+                <w:i w:val="0"/>
+                <w:color w:val="B45309"/>
+                <w:sz w:val="21"/>
+              </w:rPr>
+              <w:t>Robotics - 7A1</w:t>
+            </w:r>
+          </w:p>
+        </w:tc>
+        <w:tc>
+          <w:tcPr>
+            <w:tcW w:type="dxa" w:w="1872"/>
+            <w:vAlign w:val="center"/>
+            <w:tcBorders>
+              <w:top w:val="single" w:sz="4" w:space="0" w:color="CBD5E1"/>
+              <w:left w:val="single" w:sz="4" w:space="0" w:color="CBD5E1"/>
+              <w:bottom w:val="single" w:sz="4" w:space="0" w:color="CBD5E1"/>
+              <w:right w:val="single" w:sz="4" w:space="0" w:color="CBD5E1"/>
+            </w:tcBorders>
+            <w:shd w:fill="FEF3C7"/>
+          </w:tcPr>
+          <w:p>
+            <w:pPr>
+              <w:jc w:val="center"/>
+            </w:pPr>
+            <w:r>
+              <w:rPr>
+                <w:rFonts w:ascii="Times New Roman" w:hAnsi="Times New Roman"/>
+                <w:b/>
+                <w:i w:val="0"/>
+                <w:color w:val="B45309"/>
+                <w:sz w:val="21"/>
+              </w:rPr>
+              <w:t>Robotics - 2A1</w:t>
+            </w:r>
+          </w:p>
+        </w:tc>
+        <w:tc>
+          <w:tcPr>
+            <w:tcW w:type="dxa" w:w="1872"/>
+            <w:vAlign w:val="center"/>
+            <w:tcBorders>
+              <w:top w:val="single" w:sz="4" w:space="0" w:color="CBD5E1"/>
+              <w:left w:val="single" w:sz="4" w:space="0" w:color="CBD5E1"/>
+              <w:bottom w:val="single" w:sz="4" w:space="0" w:color="CBD5E1"/>
+              <w:right w:val="single" w:sz="4" w:space="0" w:color="CBD5E1"/>
+            </w:tcBorders>
+            <w:shd w:fill="FEF3C7"/>
+          </w:tcPr>
+          <w:p>
+            <w:pPr>
+              <w:jc w:val="center"/>
+            </w:pPr>
+            <w:r>
+              <w:rPr>
+                <w:rFonts w:ascii="Times New Roman" w:hAnsi="Times New Roman"/>
+                <w:b/>
+                <w:i w:val="0"/>
+                <w:color w:val="B45309"/>
+                <w:sz w:val="21"/>
+              </w:rPr>
+              <w:t>Robotics - 1C1</w:t>
+            </w:r>
+          </w:p>
+        </w:tc>
+        <w:tc>
+          <w:tcPr>
+            <w:tcW w:type="dxa" w:w="1872"/>
+            <w:vAlign w:val="center"/>
+            <w:tcBorders>
+              <w:top w:val="single" w:sz="4" w:space="0" w:color="CBD5E1"/>
+              <w:left w:val="single" w:sz="4" w:space="0" w:color="CBD5E1"/>
+              <w:bottom w:val="single" w:sz="4" w:space="0" w:color="CBD5E1"/>
+              <w:right w:val="single" w:sz="4" w:space="0" w:color="CBD5E1"/>
+            </w:tcBorders>
+            <w:shd w:fill="FFFFFF"/>
+          </w:tcPr>
+          <w:p>
+            <w:pPr>
+              <w:jc w:val="center"/>
+            </w:pPr>
+            <w:r>
+              <w:rPr>
+                <w:rFonts w:ascii="Times New Roman" w:hAnsi="Times New Roman"/>
+                <w:b w:val="0"/>
+                <w:i w:val="0"/>
+                <w:color w:val="94A3B8"/>
+                <w:sz w:val="19"/>
+              </w:rPr>
+            </w:r>
+          </w:p>
+        </w:tc>
+        <w:tc>
+          <w:tcPr>
+            <w:tcW w:type="dxa" w:w="1296"/>
+            <w:vAlign w:val="center"/>
+            <w:tcBorders>
+              <w:top w:val="single" w:sz="4" w:space="0" w:color="CBD5E1"/>
+              <w:left w:val="single" w:sz="4" w:space="0" w:color="CBD5E1"/>
+              <w:bottom w:val="single" w:sz="4" w:space="0" w:color="CBD5E1"/>
+              <w:right w:val="single" w:sz="4" w:space="0" w:color="CBD5E1"/>
+            </w:tcBorders>
+            <w:shd w:fill="FFFFFF"/>
+          </w:tcPr>
+          <w:p>
+            <w:pPr>
+              <w:jc w:val="center"/>
+            </w:pPr>
+            <w:r>
+              <w:rPr>
+                <w:rFonts w:ascii="Times New Roman" w:hAnsi="Times New Roman"/>
+                <w:b w:val="0"/>
+                <w:i w:val="0"/>
+                <w:color w:val="94A3B8"/>
+                <w:sz w:val="19"/>
+              </w:rPr>
+            </w:r>
+          </w:p>
+        </w:tc>
+      </w:tr>
+      <w:tr>
+        <w:tc>
+          <w:tcPr>
+            <w:tcW w:type="dxa" w:w="1296"/>
+            <w:vAlign w:val="center"/>
+            <w:vMerge/>
+            <w:tcBorders>
+              <w:top w:val="single" w:sz="4" w:space="0" w:color="CBD5E1"/>
+              <w:left w:val="single" w:sz="4" w:space="0" w:color="CBD5E1"/>
+              <w:bottom w:val="single" w:sz="4" w:space="0" w:color="CBD5E1"/>
+              <w:right w:val="single" w:sz="4" w:space="0" w:color="CBD5E1"/>
+            </w:tcBorders>
+            <w:shd w:fill="E2E8F0"/>
+          </w:tcPr>
+          <w:p/>
+        </w:tc>
+        <w:tc>
+          <w:tcPr>
+            <w:tcW w:type="dxa" w:w="1152"/>
+            <w:vAlign w:val="center"/>
+            <w:tcBorders>
+              <w:top w:val="single" w:sz="4" w:space="0" w:color="CBD5E1"/>
+              <w:left w:val="single" w:sz="4" w:space="0" w:color="CBD5E1"/>
+              <w:bottom w:val="single" w:sz="4" w:space="0" w:color="CBD5E1"/>
+              <w:right w:val="single" w:sz="4" w:space="0" w:color="CBD5E1"/>
+            </w:tcBorders>
+            <w:shd w:fill="FAFAFA"/>
+          </w:tcPr>
+          <w:p>
+            <w:pPr>
+              <w:jc w:val="center"/>
+            </w:pPr>
+            <w:r>
+              <w:rPr>
+                <w:rFonts w:ascii="Times New Roman" w:hAnsi="Times New Roman"/>
+                <w:b/>
+                <w:i w:val="0"/>
+                <w:color w:val="0F172A"/>
+                <w:sz w:val="20"/>
               </w:rPr>
               <w:t>Tiết 5</w:t>
             </w:r>
@@ -1150,45 +2554,201 @@
         </w:tc>
         <w:tc>
           <w:tcPr>
-            <w:tcW w:type="dxa" w:w="1080"/>
+            <w:tcW w:type="dxa" w:w="2016"/>
+            <w:vAlign w:val="center"/>
+            <w:tcBorders>
+              <w:top w:val="single" w:sz="4" w:space="0" w:color="CBD5E1"/>
+              <w:left w:val="single" w:sz="4" w:space="0" w:color="CBD5E1"/>
+              <w:bottom w:val="single" w:sz="4" w:space="0" w:color="CBD5E1"/>
+              <w:right w:val="single" w:sz="4" w:space="0" w:color="CBD5E1"/>
+            </w:tcBorders>
+            <w:shd w:fill="F8FAFC"/>
           </w:tcPr>
-          <w:p/>
+          <w:p>
+            <w:pPr>
+              <w:jc w:val="center"/>
+            </w:pPr>
+            <w:r>
+              <w:rPr>
+                <w:rFonts w:ascii="Times New Roman" w:hAnsi="Times New Roman"/>
+                <w:b/>
+                <w:i w:val="0"/>
+                <w:color w:val="334155"/>
+                <w:sz w:val="18"/>
+              </w:rPr>
+              <w:t>16:10 - 16:25</w:t>
+              <w:br/>
+              <w:t>(Dọn dẹp)</w:t>
+            </w:r>
+          </w:p>
         </w:tc>
         <w:tc>
           <w:tcPr>
-            <w:tcW w:type="dxa" w:w="1080"/>
+            <w:tcW w:type="dxa" w:w="1872"/>
+            <w:vAlign w:val="center"/>
+            <w:tcBorders>
+              <w:top w:val="single" w:sz="4" w:space="0" w:color="CBD5E1"/>
+              <w:left w:val="single" w:sz="4" w:space="0" w:color="CBD5E1"/>
+              <w:bottom w:val="single" w:sz="4" w:space="0" w:color="CBD5E1"/>
+              <w:right w:val="single" w:sz="4" w:space="0" w:color="CBD5E1"/>
+            </w:tcBorders>
+            <w:shd w:fill="FFFFFF"/>
           </w:tcPr>
-          <w:p/>
+          <w:p>
+            <w:pPr>
+              <w:jc w:val="center"/>
+            </w:pPr>
+            <w:r>
+              <w:rPr>
+                <w:rFonts w:ascii="Times New Roman" w:hAnsi="Times New Roman"/>
+                <w:b w:val="0"/>
+                <w:i w:val="0"/>
+                <w:color w:val="94A3B8"/>
+                <w:sz w:val="19"/>
+              </w:rPr>
+            </w:r>
+          </w:p>
         </w:tc>
         <w:tc>
           <w:tcPr>
-            <w:tcW w:type="dxa" w:w="1080"/>
+            <w:tcW w:type="dxa" w:w="1872"/>
+            <w:vAlign w:val="center"/>
+            <w:tcBorders>
+              <w:top w:val="single" w:sz="4" w:space="0" w:color="CBD5E1"/>
+              <w:left w:val="single" w:sz="4" w:space="0" w:color="CBD5E1"/>
+              <w:bottom w:val="single" w:sz="4" w:space="0" w:color="CBD5E1"/>
+              <w:right w:val="single" w:sz="4" w:space="0" w:color="CBD5E1"/>
+            </w:tcBorders>
+            <w:shd w:fill="FFFFFF"/>
           </w:tcPr>
-          <w:p/>
+          <w:p>
+            <w:pPr>
+              <w:jc w:val="center"/>
+            </w:pPr>
+            <w:r>
+              <w:rPr>
+                <w:rFonts w:ascii="Times New Roman" w:hAnsi="Times New Roman"/>
+                <w:b w:val="0"/>
+                <w:i w:val="0"/>
+                <w:color w:val="94A3B8"/>
+                <w:sz w:val="19"/>
+              </w:rPr>
+            </w:r>
+          </w:p>
         </w:tc>
         <w:tc>
           <w:tcPr>
-            <w:tcW w:type="dxa" w:w="1080"/>
+            <w:tcW w:type="dxa" w:w="1872"/>
+            <w:vAlign w:val="center"/>
+            <w:tcBorders>
+              <w:top w:val="single" w:sz="4" w:space="0" w:color="CBD5E1"/>
+              <w:left w:val="single" w:sz="4" w:space="0" w:color="CBD5E1"/>
+              <w:bottom w:val="single" w:sz="4" w:space="0" w:color="CBD5E1"/>
+              <w:right w:val="single" w:sz="4" w:space="0" w:color="CBD5E1"/>
+            </w:tcBorders>
+            <w:shd w:fill="FFFFFF"/>
           </w:tcPr>
-          <w:p/>
+          <w:p>
+            <w:pPr>
+              <w:jc w:val="center"/>
+            </w:pPr>
+            <w:r>
+              <w:rPr>
+                <w:rFonts w:ascii="Times New Roman" w:hAnsi="Times New Roman"/>
+                <w:b w:val="0"/>
+                <w:i w:val="0"/>
+                <w:color w:val="94A3B8"/>
+                <w:sz w:val="19"/>
+              </w:rPr>
+            </w:r>
+          </w:p>
         </w:tc>
         <w:tc>
           <w:tcPr>
-            <w:tcW w:type="dxa" w:w="1080"/>
+            <w:tcW w:type="dxa" w:w="1872"/>
+            <w:vAlign w:val="center"/>
+            <w:tcBorders>
+              <w:top w:val="single" w:sz="4" w:space="0" w:color="CBD5E1"/>
+              <w:left w:val="single" w:sz="4" w:space="0" w:color="CBD5E1"/>
+              <w:bottom w:val="single" w:sz="4" w:space="0" w:color="CBD5E1"/>
+              <w:right w:val="single" w:sz="4" w:space="0" w:color="CBD5E1"/>
+            </w:tcBorders>
+            <w:shd w:fill="FFFFFF"/>
           </w:tcPr>
-          <w:p/>
+          <w:p>
+            <w:pPr>
+              <w:jc w:val="center"/>
+            </w:pPr>
+            <w:r>
+              <w:rPr>
+                <w:rFonts w:ascii="Times New Roman" w:hAnsi="Times New Roman"/>
+                <w:b w:val="0"/>
+                <w:i w:val="0"/>
+                <w:color w:val="94A3B8"/>
+                <w:sz w:val="19"/>
+              </w:rPr>
+            </w:r>
+          </w:p>
         </w:tc>
         <w:tc>
           <w:tcPr>
-            <w:tcW w:type="dxa" w:w="1080"/>
+            <w:tcW w:type="dxa" w:w="1872"/>
+            <w:vAlign w:val="center"/>
+            <w:tcBorders>
+              <w:top w:val="single" w:sz="4" w:space="0" w:color="CBD5E1"/>
+              <w:left w:val="single" w:sz="4" w:space="0" w:color="CBD5E1"/>
+              <w:bottom w:val="single" w:sz="4" w:space="0" w:color="CBD5E1"/>
+              <w:right w:val="single" w:sz="4" w:space="0" w:color="CBD5E1"/>
+            </w:tcBorders>
+            <w:shd w:fill="FFFFFF"/>
           </w:tcPr>
-          <w:p/>
+          <w:p>
+            <w:pPr>
+              <w:jc w:val="center"/>
+            </w:pPr>
+            <w:r>
+              <w:rPr>
+                <w:rFonts w:ascii="Times New Roman" w:hAnsi="Times New Roman"/>
+                <w:b w:val="0"/>
+                <w:i w:val="0"/>
+                <w:color w:val="94A3B8"/>
+                <w:sz w:val="19"/>
+              </w:rPr>
+            </w:r>
+          </w:p>
+        </w:tc>
+        <w:tc>
+          <w:tcPr>
+            <w:tcW w:type="dxa" w:w="1296"/>
+            <w:vAlign w:val="center"/>
+            <w:tcBorders>
+              <w:top w:val="single" w:sz="4" w:space="0" w:color="CBD5E1"/>
+              <w:left w:val="single" w:sz="4" w:space="0" w:color="CBD5E1"/>
+              <w:bottom w:val="single" w:sz="4" w:space="0" w:color="CBD5E1"/>
+              <w:right w:val="single" w:sz="4" w:space="0" w:color="CBD5E1"/>
+            </w:tcBorders>
+            <w:shd w:fill="FFFFFF"/>
+          </w:tcPr>
+          <w:p>
+            <w:pPr>
+              <w:jc w:val="center"/>
+            </w:pPr>
+            <w:r>
+              <w:rPr>
+                <w:rFonts w:ascii="Times New Roman" w:hAnsi="Times New Roman"/>
+                <w:b w:val="0"/>
+                <w:i w:val="0"/>
+                <w:color w:val="94A3B8"/>
+                <w:sz w:val="19"/>
+              </w:rPr>
+            </w:r>
+          </w:p>
         </w:tc>
       </w:tr>
     </w:tbl>
     <w:sectPr>
-      <w:pgSz w:w="12240" w:h="15840"/>
-      <w:pgMar w:top="1440" w:right="1800" w:bottom="1440" w:left="1800" w:header="720" w:footer="720" w:gutter="0"/>
+      <w:pgSz w:w="16834" w:h="11909" w:orient="landscape"/>
+      <w:pgMar w:top="720" w:right="720" w:bottom="720" w:left="720" w:header="720" w:footer="720" w:gutter="0"/>
       <w:cols w:space="720"/>
       <w:docGrid w:linePitch="360"/>
     </w:sectPr>

</xml_diff>

<commit_message>
Cập nhật Thời khóa biểu giáo viên từ file 'TKB toàn trường CHECK - chuẩn.xlsx'
</commit_message>
<xml_diff>
--- a/Thời khóa biểu giáo viên/Thời khóa biểu - Đậu Đình Nguyên.docx
+++ b/Thời khóa biểu giáo viên/Thời khóa biểu - Đậu Đình Nguyên.docx
@@ -47,7 +47,7 @@
           <w:color w:val="0F172A"/>
           <w:sz w:val="22"/>
         </w:rPr>
-        <w:t>Bộ môn: Tin học &amp; Robotics  |  Tổng số tiết/tuần: 26 tiết  |  Áp dụng từ 04/08/2025</w:t>
+        <w:t>Bộ môn: Tin học &amp; Robotics  |  Tổng số tiết/tuần: 25 tiết  |  Theo TKB toàn trường CHECK - chuẩn</w:t>
       </w:r>
     </w:p>
     <w:tbl>
@@ -897,7 +897,7 @@
               <w:bottom w:val="single" w:sz="4" w:space="0" w:color="CBD5E1"/>
               <w:right w:val="single" w:sz="4" w:space="0" w:color="CBD5E1"/>
             </w:tcBorders>
-            <w:shd w:fill="E0F2FE"/>
+            <w:shd w:fill="FFFFFF"/>
           </w:tcPr>
           <w:p>
             <w:pPr>
@@ -906,12 +906,11 @@
             <w:r>
               <w:rPr>
                 <w:rFonts w:ascii="Times New Roman" w:hAnsi="Times New Roman"/>
-                <w:b/>
+                <w:b w:val="0"/>
                 <w:i w:val="0"/>
-                <w:color w:val="0369A1"/>
-                <w:sz w:val="21"/>
+                <w:color w:val="94A3B8"/>
+                <w:sz w:val="19"/>
               </w:rPr>
-              <w:t>Tin - 7A1</w:t>
             </w:r>
           </w:p>
         </w:tc>
@@ -1007,7 +1006,7 @@
               <w:bottom w:val="single" w:sz="4" w:space="0" w:color="CBD5E1"/>
               <w:right w:val="single" w:sz="4" w:space="0" w:color="CBD5E1"/>
             </w:tcBorders>
-            <w:shd w:fill="E0F2FE"/>
+            <w:shd w:fill="FFFFFF"/>
           </w:tcPr>
           <w:p>
             <w:pPr>
@@ -1016,12 +1015,11 @@
             <w:r>
               <w:rPr>
                 <w:rFonts w:ascii="Times New Roman" w:hAnsi="Times New Roman"/>
-                <w:b/>
+                <w:b w:val="0"/>
                 <w:i w:val="0"/>
-                <w:color w:val="0369A1"/>
-                <w:sz w:val="21"/>
+                <w:color w:val="94A3B8"/>
+                <w:sz w:val="19"/>
               </w:rPr>
-              <w:t>Tin - 2C1</w:t>
             </w:r>
           </w:p>
         </w:tc>

</xml_diff>